<commit_message>
Move the code, run output and AI audit into the HW2 report body
Week 4 lost points for exactly this shape of problem: the AI-audit table, the R
code and the run output all existed, but they lived in separate files rather
than in the document being graded, and were marked as missing.

Four appendices added to the end of the report, nothing in the existing body
touched:

  A  the complete R rebuild script, not excerpted
  B  the real console output of that script, captured verbatim
  C  an AI use audit table - seven entries, four of them rejections, plus the
     ORGANISM reset the student found on the platform that AI was not involved in
  D  sessionInfo()

Also adds r_rebuild/hw2_run_log.txt as the standalone copy of the run output.

Co-Authored-By: Claude Opus 5 <noreply@anthropic.com>
</commit_message>
<xml_diff>
--- a/Week5/HW2/作业二_EMP-Web分析报告.docx
+++ b/Week5/HW2/作业二_EMP-Web分析报告.docx
@@ -2833,6 +2833,3980 @@
           <w:rFonts w:ascii="宋体" w:eastAsia="宋体" w:hAnsi="宋体" w:cs="宋体"/>
         </w:rPr>
       </w:pPr>
+    </w:p>
+    <w:p>
+      <w:r>
+        <w:br w:type="page"/>
+      </w:r>
+    </w:p>
+    <w:p>
+      <w:pPr>
+        <w:spacing w:before="320" w:after="120"/>
+      </w:pPr>
+      <w:r>
+        <w:rPr>
+          <w:b/>
+          <w:color w:val="2F2F6F"/>
+          <w:sz w:val="30"/>
+          <w:rFonts w:eastAsia="Microsoft YaHei"/>
+        </w:rPr>
+        <w:t>附录 A — R 重建脚本（完整代码）</w:t>
+      </w:r>
+    </w:p>
+    <w:p>
+      <w:pPr>
+        <w:spacing w:after="120"/>
+      </w:pPr>
+      <w:r>
+        <w:rPr>
+          <w:i w:val="0"/>
+          <w:color w:val="1A1A1A"/>
+          <w:sz w:val="21"/>
+          <w:rFonts w:eastAsia="Microsoft YaHei"/>
+        </w:rPr>
+        <w:t>平台 Sync 导出的 results/ 三个文件均为 4 字节空文件（五次同步皆然），因此用下列脚本在本机 R 中从同一份源数据重建 PCA、差异表与火山图。本附录为完整代码，未省略。</w:t>
+      </w:r>
+    </w:p>
+    <w:p>
+      <w:pPr>
+        <w:spacing w:after="120"/>
+      </w:pPr>
+      <w:r>
+        <w:rPr>
+          <w:i/>
+          <w:color w:val="1A1A1A"/>
+          <w:sz w:val="21"/>
+          <w:rFonts w:eastAsia="Microsoft YaHei"/>
+        </w:rPr>
+        <w:t>注意：本脚本的输出是 R 独立重跑的结果，不是 EasyMultiProfiler-Web 平台的输出。</w:t>
+      </w:r>
+    </w:p>
+    <w:p>
+      <w:pPr>
+        <w:spacing w:after="0" w:before="0" w:line="240" w:lineRule="auto"/>
+      </w:pPr>
+      <w:r>
+        <w:rPr>
+          <w:rFonts w:ascii="Consolas" w:hAnsi="Consolas" w:eastAsia="Consolas"/>
+          <w:sz w:val="15"/>
+        </w:rPr>
+        <w:t># =============================================================================</w:t>
+      </w:r>
+    </w:p>
+    <w:p>
+      <w:pPr>
+        <w:spacing w:after="0" w:before="0" w:line="240" w:lineRule="auto"/>
+      </w:pPr>
+      <w:r>
+        <w:rPr>
+          <w:rFonts w:ascii="Consolas" w:hAnsi="Consolas" w:eastAsia="Consolas"/>
+          <w:sz w:val="15"/>
+        </w:rPr>
+        <w:t># Week 5 Homework 2 — 平台导出缺失产物的 R 重建</w:t>
+      </w:r>
+    </w:p>
+    <w:p>
+      <w:pPr>
+        <w:spacing w:after="0" w:before="0" w:line="240" w:lineRule="auto"/>
+      </w:pPr>
+      <w:r>
+        <w:rPr>
+          <w:rFonts w:ascii="Consolas" w:hAnsi="Consolas" w:eastAsia="Consolas"/>
+          <w:sz w:val="15"/>
+        </w:rPr>
+        <w:t># Zixuan Zeng / SUAT24000114 · 2026-09-23</w:t>
+      </w:r>
+    </w:p>
+    <w:p>
+      <w:pPr>
+        <w:spacing w:after="0" w:before="0" w:line="240" w:lineRule="auto"/>
+      </w:pPr>
+      <w:r>
+        <w:rPr>
+          <w:rFonts w:ascii="Consolas" w:hAnsi="Consolas" w:eastAsia="Consolas"/>
+          <w:sz w:val="15"/>
+        </w:rPr>
+        <w:t>#</w:t>
+      </w:r>
+    </w:p>
+    <w:p>
+      <w:pPr>
+        <w:spacing w:after="0" w:before="0" w:line="240" w:lineRule="auto"/>
+      </w:pPr>
+      <w:r>
+        <w:rPr>
+          <w:rFonts w:ascii="Consolas" w:hAnsi="Consolas" w:eastAsia="Consolas"/>
+          <w:sz w:val="15"/>
+        </w:rPr>
+        <w:t># 背景：EMP-Web 的 Sync 把 diff_analysis / dimension / enrichment 三个结果文件</w:t>
+      </w:r>
+    </w:p>
+    <w:p>
+      <w:pPr>
+        <w:spacing w:after="0" w:before="0" w:line="240" w:lineRule="auto"/>
+      </w:pPr>
+      <w:r>
+        <w:rPr>
+          <w:rFonts w:ascii="Consolas" w:hAnsi="Consolas" w:eastAsia="Consolas"/>
+          <w:sz w:val="15"/>
+        </w:rPr>
+        <w:t>#       导成了空文件（4 字节，内容为 ""）。本脚本用同一批源数据在 R 里重建</w:t>
+      </w:r>
+    </w:p>
+    <w:p>
+      <w:pPr>
+        <w:spacing w:after="0" w:before="0" w:line="240" w:lineRule="auto"/>
+      </w:pPr>
+      <w:r>
+        <w:rPr>
+          <w:rFonts w:ascii="Consolas" w:hAnsi="Consolas" w:eastAsia="Consolas"/>
+          <w:sz w:val="15"/>
+        </w:rPr>
+        <w:t>#       这些产物。</w:t>
+      </w:r>
+    </w:p>
+    <w:p>
+      <w:pPr>
+        <w:spacing w:after="0" w:before="0" w:line="240" w:lineRule="auto"/>
+      </w:pPr>
+      <w:r>
+        <w:rPr>
+          <w:rFonts w:ascii="Consolas" w:hAnsi="Consolas" w:eastAsia="Consolas"/>
+          <w:sz w:val="15"/>
+        </w:rPr>
+        <w:t>#</w:t>
+      </w:r>
+    </w:p>
+    <w:p>
+      <w:pPr>
+        <w:spacing w:after="0" w:before="0" w:line="240" w:lineRule="auto"/>
+      </w:pPr>
+      <w:r>
+        <w:rPr>
+          <w:rFonts w:ascii="Consolas" w:hAnsi="Consolas" w:eastAsia="Consolas"/>
+          <w:sz w:val="15"/>
+        </w:rPr>
+        <w:t># 重要声明：</w:t>
+      </w:r>
+    </w:p>
+    <w:p>
+      <w:pPr>
+        <w:spacing w:after="0" w:before="0" w:line="240" w:lineRule="auto"/>
+      </w:pPr>
+      <w:r>
+        <w:rPr>
+          <w:rFonts w:ascii="Consolas" w:hAnsi="Consolas" w:eastAsia="Consolas"/>
+          <w:sz w:val="15"/>
+        </w:rPr>
+        <w:t>#   本脚本的输出是「用 R 独立重跑得到的结果」，不是 EasyMultiProfiler-Web</w:t>
+      </w:r>
+    </w:p>
+    <w:p>
+      <w:pPr>
+        <w:spacing w:after="0" w:before="0" w:line="240" w:lineRule="auto"/>
+      </w:pPr>
+      <w:r>
+        <w:rPr>
+          <w:rFonts w:ascii="Consolas" w:hAnsi="Consolas" w:eastAsia="Consolas"/>
+          <w:sz w:val="15"/>
+        </w:rPr>
+        <w:t>#   平台的输出。两者用的是同一份输入和同一个对比方向，但统计实现、默认参数</w:t>
+      </w:r>
+    </w:p>
+    <w:p>
+      <w:pPr>
+        <w:spacing w:after="0" w:before="0" w:line="240" w:lineRule="auto"/>
+      </w:pPr>
+      <w:r>
+        <w:rPr>
+          <w:rFonts w:ascii="Consolas" w:hAnsi="Consolas" w:eastAsia="Consolas"/>
+          <w:sz w:val="15"/>
+        </w:rPr>
+        <w:t>#   与版本不同，数值不保证完全一致。报告中引用时必须标明来源为本次 R 重建。</w:t>
+      </w:r>
+    </w:p>
+    <w:p>
+      <w:pPr>
+        <w:spacing w:after="0" w:before="0" w:line="240" w:lineRule="auto"/>
+      </w:pPr>
+      <w:r>
+        <w:rPr>
+          <w:rFonts w:ascii="Consolas" w:hAnsi="Consolas" w:eastAsia="Consolas"/>
+          <w:sz w:val="15"/>
+        </w:rPr>
+        <w:t>#</w:t>
+      </w:r>
+    </w:p>
+    <w:p>
+      <w:pPr>
+        <w:spacing w:after="0" w:before="0" w:line="240" w:lineRule="auto"/>
+      </w:pPr>
+      <w:r>
+        <w:rPr>
+          <w:rFonts w:ascii="Consolas" w:hAnsi="Consolas" w:eastAsia="Consolas"/>
+          <w:sz w:val="15"/>
+        </w:rPr>
+        <w:t># 输入（均为原始文件，未改动）：</w:t>
+      </w:r>
+    </w:p>
+    <w:p>
+      <w:pPr>
+        <w:spacing w:after="0" w:before="0" w:line="240" w:lineRule="auto"/>
+      </w:pPr>
+      <w:r>
+        <w:rPr>
+          <w:rFonts w:ascii="Consolas" w:hAnsi="Consolas" w:eastAsia="Consolas"/>
+          <w:sz w:val="15"/>
+        </w:rPr>
+        <w:t>#   EasyMultiProfiler-Web/tests/RNAseq_output.csv    原始整数 counts, 24393 x 24</w:t>
+      </w:r>
+    </w:p>
+    <w:p>
+      <w:pPr>
+        <w:spacing w:after="0" w:before="0" w:line="240" w:lineRule="auto"/>
+      </w:pPr>
+      <w:r>
+        <w:rPr>
+          <w:rFonts w:ascii="Consolas" w:hAnsi="Consolas" w:eastAsia="Consolas"/>
+          <w:sz w:val="15"/>
+        </w:rPr>
+        <w:t>#   EasyMultiProfiler-Web/tests/RNAseq_mapping.csv   样本分组</w:t>
+      </w:r>
+    </w:p>
+    <w:p>
+      <w:pPr>
+        <w:spacing w:after="0" w:before="0" w:line="240" w:lineRule="auto"/>
+      </w:pPr>
+      <w:r>
+        <w:rPr>
+          <w:rFonts w:ascii="Consolas" w:hAnsi="Consolas" w:eastAsia="Consolas"/>
+          <w:sz w:val="15"/>
+        </w:rPr>
+        <w:t>#   week5/RNAseq_output_assay.csv                    仅用于取 EMP 保留的基因名</w:t>
+      </w:r>
+    </w:p>
+    <w:p>
+      <w:pPr>
+        <w:spacing w:after="0" w:before="0" w:line="240" w:lineRule="auto"/>
+      </w:pPr>
+      <w:r>
+        <w:rPr>
+          <w:rFonts w:ascii="Consolas" w:hAnsi="Consolas" w:eastAsia="Consolas"/>
+          <w:sz w:val="15"/>
+        </w:rPr>
+        <w:t>#</w:t>
+      </w:r>
+    </w:p>
+    <w:p>
+      <w:pPr>
+        <w:spacing w:after="0" w:before="0" w:line="240" w:lineRule="auto"/>
+      </w:pPr>
+      <w:r>
+        <w:rPr>
+          <w:rFonts w:ascii="Consolas" w:hAnsi="Consolas" w:eastAsia="Consolas"/>
+          <w:sz w:val="15"/>
+        </w:rPr>
+        <w:t># 输出：week5/hw2_rebuild/</w:t>
+      </w:r>
+    </w:p>
+    <w:p>
+      <w:pPr>
+        <w:spacing w:after="0" w:before="0" w:line="240" w:lineRule="auto"/>
+      </w:pPr>
+      <w:r>
+        <w:rPr>
+          <w:rFonts w:ascii="Consolas" w:hAnsi="Consolas" w:eastAsia="Consolas"/>
+          <w:sz w:val="15"/>
+        </w:rPr>
+        <w:t># =============================================================================</w:t>
+      </w:r>
+    </w:p>
+    <w:p>
+      <w:pPr>
+        <w:spacing w:after="0" w:before="0" w:line="240" w:lineRule="auto"/>
+      </w:pPr>
+      <w:r>
+        <w:rPr>
+          <w:rFonts w:ascii="Consolas" w:hAnsi="Consolas" w:eastAsia="Consolas"/>
+          <w:sz w:val="15"/>
+        </w:rPr>
+      </w:r>
+    </w:p>
+    <w:p>
+      <w:pPr>
+        <w:spacing w:after="0" w:before="0" w:line="240" w:lineRule="auto"/>
+      </w:pPr>
+      <w:r>
+        <w:rPr>
+          <w:rFonts w:ascii="Consolas" w:hAnsi="Consolas" w:eastAsia="Consolas"/>
+          <w:sz w:val="15"/>
+        </w:rPr>
+        <w:t>suppressPackageStartupMessages({</w:t>
+      </w:r>
+    </w:p>
+    <w:p>
+      <w:pPr>
+        <w:spacing w:after="0" w:before="0" w:line="240" w:lineRule="auto"/>
+      </w:pPr>
+      <w:r>
+        <w:rPr>
+          <w:rFonts w:ascii="Consolas" w:hAnsi="Consolas" w:eastAsia="Consolas"/>
+          <w:sz w:val="15"/>
+        </w:rPr>
+        <w:t xml:space="preserve">  library(DESeq2); library(ggplot2); library(ggrepel)</w:t>
+      </w:r>
+    </w:p>
+    <w:p>
+      <w:pPr>
+        <w:spacing w:after="0" w:before="0" w:line="240" w:lineRule="auto"/>
+      </w:pPr>
+      <w:r>
+        <w:rPr>
+          <w:rFonts w:ascii="Consolas" w:hAnsi="Consolas" w:eastAsia="Consolas"/>
+          <w:sz w:val="15"/>
+        </w:rPr>
+        <w:t>})</w:t>
+      </w:r>
+    </w:p>
+    <w:p>
+      <w:pPr>
+        <w:spacing w:after="0" w:before="0" w:line="240" w:lineRule="auto"/>
+      </w:pPr>
+      <w:r>
+        <w:rPr>
+          <w:rFonts w:ascii="Consolas" w:hAnsi="Consolas" w:eastAsia="Consolas"/>
+          <w:sz w:val="15"/>
+        </w:rPr>
+      </w:r>
+    </w:p>
+    <w:p>
+      <w:pPr>
+        <w:spacing w:after="0" w:before="0" w:line="240" w:lineRule="auto"/>
+      </w:pPr>
+      <w:r>
+        <w:rPr>
+          <w:rFonts w:ascii="Consolas" w:hAnsi="Consolas" w:eastAsia="Consolas"/>
+          <w:sz w:val="15"/>
+        </w:rPr>
+        <w:t>TESTS &lt;- "D:/BioLession in total/Bioinformatics/week1/EasyMultiProfiler-Web/tests"</w:t>
+      </w:r>
+    </w:p>
+    <w:p>
+      <w:pPr>
+        <w:spacing w:after="0" w:before="0" w:line="240" w:lineRule="auto"/>
+      </w:pPr>
+      <w:r>
+        <w:rPr>
+          <w:rFonts w:ascii="Consolas" w:hAnsi="Consolas" w:eastAsia="Consolas"/>
+          <w:sz w:val="15"/>
+        </w:rPr>
+        <w:t>W5    &lt;- "D:/BioLession in total/Bioinformatics/week5"</w:t>
+      </w:r>
+    </w:p>
+    <w:p>
+      <w:pPr>
+        <w:spacing w:after="0" w:before="0" w:line="240" w:lineRule="auto"/>
+      </w:pPr>
+      <w:r>
+        <w:rPr>
+          <w:rFonts w:ascii="Consolas" w:hAnsi="Consolas" w:eastAsia="Consolas"/>
+          <w:sz w:val="15"/>
+        </w:rPr>
+        <w:t>OUT   &lt;- file.path(W5, "hw2_rebuild")</w:t>
+      </w:r>
+    </w:p>
+    <w:p>
+      <w:pPr>
+        <w:spacing w:after="0" w:before="0" w:line="240" w:lineRule="auto"/>
+      </w:pPr>
+      <w:r>
+        <w:rPr>
+          <w:rFonts w:ascii="Consolas" w:hAnsi="Consolas" w:eastAsia="Consolas"/>
+          <w:sz w:val="15"/>
+        </w:rPr>
+        <w:t>dir.create(OUT, showWarnings = FALSE, recursive = TRUE)</w:t>
+      </w:r>
+    </w:p>
+    <w:p>
+      <w:pPr>
+        <w:spacing w:after="0" w:before="0" w:line="240" w:lineRule="auto"/>
+      </w:pPr>
+      <w:r>
+        <w:rPr>
+          <w:rFonts w:ascii="Consolas" w:hAnsi="Consolas" w:eastAsia="Consolas"/>
+          <w:sz w:val="15"/>
+        </w:rPr>
+      </w:r>
+    </w:p>
+    <w:p>
+      <w:pPr>
+        <w:spacing w:after="0" w:before="0" w:line="240" w:lineRule="auto"/>
+      </w:pPr>
+      <w:r>
+        <w:rPr>
+          <w:rFonts w:ascii="Consolas" w:hAnsi="Consolas" w:eastAsia="Consolas"/>
+          <w:sz w:val="15"/>
+        </w:rPr>
+        <w:t># --- 1. 读入 -----------------------------------------------------------------</w:t>
+      </w:r>
+    </w:p>
+    <w:p>
+      <w:pPr>
+        <w:spacing w:after="0" w:before="0" w:line="240" w:lineRule="auto"/>
+      </w:pPr>
+      <w:r>
+        <w:rPr>
+          <w:rFonts w:ascii="Consolas" w:hAnsi="Consolas" w:eastAsia="Consolas"/>
+          <w:sz w:val="15"/>
+        </w:rPr>
+        <w:t>counts &lt;- read.csv(file.path(TESTS, "RNAseq_output.csv"),</w:t>
+      </w:r>
+    </w:p>
+    <w:p>
+      <w:pPr>
+        <w:spacing w:after="0" w:before="0" w:line="240" w:lineRule="auto"/>
+      </w:pPr>
+      <w:r>
+        <w:rPr>
+          <w:rFonts w:ascii="Consolas" w:hAnsi="Consolas" w:eastAsia="Consolas"/>
+          <w:sz w:val="15"/>
+        </w:rPr>
+        <w:t xml:space="preserve">                   row.names = 1, check.names = FALSE)</w:t>
+      </w:r>
+    </w:p>
+    <w:p>
+      <w:pPr>
+        <w:spacing w:after="0" w:before="0" w:line="240" w:lineRule="auto"/>
+      </w:pPr>
+      <w:r>
+        <w:rPr>
+          <w:rFonts w:ascii="Consolas" w:hAnsi="Consolas" w:eastAsia="Consolas"/>
+          <w:sz w:val="15"/>
+        </w:rPr>
+        <w:t>meta   &lt;- read.csv(file.path(TESTS, "RNAseq_mapping.csv"),</w:t>
+      </w:r>
+    </w:p>
+    <w:p>
+      <w:pPr>
+        <w:spacing w:after="0" w:before="0" w:line="240" w:lineRule="auto"/>
+      </w:pPr>
+      <w:r>
+        <w:rPr>
+          <w:rFonts w:ascii="Consolas" w:hAnsi="Consolas" w:eastAsia="Consolas"/>
+          <w:sz w:val="15"/>
+        </w:rPr>
+        <w:t xml:space="preserve">                   fileEncoding = "UTF-8-BOM", check.names = FALSE)</w:t>
+      </w:r>
+    </w:p>
+    <w:p>
+      <w:pPr>
+        <w:spacing w:after="0" w:before="0" w:line="240" w:lineRule="auto"/>
+      </w:pPr>
+      <w:r>
+        <w:rPr>
+          <w:rFonts w:ascii="Consolas" w:hAnsi="Consolas" w:eastAsia="Consolas"/>
+          <w:sz w:val="15"/>
+        </w:rPr>
+        <w:t>rownames(meta) &lt;- meta$SampleID</w:t>
+      </w:r>
+    </w:p>
+    <w:p>
+      <w:pPr>
+        <w:spacing w:after="0" w:before="0" w:line="240" w:lineRule="auto"/>
+      </w:pPr>
+      <w:r>
+        <w:rPr>
+          <w:rFonts w:ascii="Consolas" w:hAnsi="Consolas" w:eastAsia="Consolas"/>
+          <w:sz w:val="15"/>
+        </w:rPr>
+      </w:r>
+    </w:p>
+    <w:p>
+      <w:pPr>
+        <w:spacing w:after="0" w:before="0" w:line="240" w:lineRule="auto"/>
+      </w:pPr>
+      <w:r>
+        <w:rPr>
+          <w:rFonts w:ascii="Consolas" w:hAnsi="Consolas" w:eastAsia="Consolas"/>
+          <w:sz w:val="15"/>
+        </w:rPr>
+        <w:t>cm &lt;- as.matrix(counts)</w:t>
+      </w:r>
+    </w:p>
+    <w:p>
+      <w:pPr>
+        <w:spacing w:after="0" w:before="0" w:line="240" w:lineRule="auto"/>
+      </w:pPr>
+      <w:r>
+        <w:rPr>
+          <w:rFonts w:ascii="Consolas" w:hAnsi="Consolas" w:eastAsia="Consolas"/>
+          <w:sz w:val="15"/>
+        </w:rPr>
+      </w:r>
+    </w:p>
+    <w:p>
+      <w:pPr>
+        <w:spacing w:after="0" w:before="0" w:line="240" w:lineRule="auto"/>
+      </w:pPr>
+      <w:r>
+        <w:rPr>
+          <w:rFonts w:ascii="Consolas" w:hAnsi="Consolas" w:eastAsia="Consolas"/>
+          <w:sz w:val="15"/>
+        </w:rPr>
+        <w:t># --- 2. 输入断言：出问题要大声失败，不要静默继续 -----------------------------</w:t>
+      </w:r>
+    </w:p>
+    <w:p>
+      <w:pPr>
+        <w:spacing w:after="0" w:before="0" w:line="240" w:lineRule="auto"/>
+      </w:pPr>
+      <w:r>
+        <w:rPr>
+          <w:rFonts w:ascii="Consolas" w:hAnsi="Consolas" w:eastAsia="Consolas"/>
+          <w:sz w:val="15"/>
+        </w:rPr>
+        <w:t>stopifnot(all(cm == round(cm)), all(cm &gt;= 0))                  # 非负整数</w:t>
+      </w:r>
+    </w:p>
+    <w:p>
+      <w:pPr>
+        <w:spacing w:after="0" w:before="0" w:line="240" w:lineRule="auto"/>
+      </w:pPr>
+      <w:r>
+        <w:rPr>
+          <w:rFonts w:ascii="Consolas" w:hAnsi="Consolas" w:eastAsia="Consolas"/>
+          <w:sz w:val="15"/>
+        </w:rPr>
+        <w:t>stopifnot(identical(colnames(cm), rownames(meta)))             # 列名与元数据严格对齐</w:t>
+      </w:r>
+    </w:p>
+    <w:p>
+      <w:pPr>
+        <w:spacing w:after="0" w:before="0" w:line="240" w:lineRule="auto"/>
+      </w:pPr>
+      <w:r>
+        <w:rPr>
+          <w:rFonts w:ascii="Consolas" w:hAnsi="Consolas" w:eastAsia="Consolas"/>
+          <w:sz w:val="15"/>
+        </w:rPr>
+        <w:t>stopifnot(!anyDuplicated(colnames(cm)), !anyDuplicated(rownames(cm)))</w:t>
+      </w:r>
+    </w:p>
+    <w:p>
+      <w:pPr>
+        <w:spacing w:after="0" w:before="0" w:line="240" w:lineRule="auto"/>
+      </w:pPr>
+      <w:r>
+        <w:rPr>
+          <w:rFonts w:ascii="Consolas" w:hAnsi="Consolas" w:eastAsia="Consolas"/>
+          <w:sz w:val="15"/>
+        </w:rPr>
+        <w:t>cat(sprintf("输入: %d 基因 x %d 样本, 全为非负整数, 样本顺序一致\n",</w:t>
+      </w:r>
+    </w:p>
+    <w:p>
+      <w:pPr>
+        <w:spacing w:after="0" w:before="0" w:line="240" w:lineRule="auto"/>
+      </w:pPr>
+      <w:r>
+        <w:rPr>
+          <w:rFonts w:ascii="Consolas" w:hAnsi="Consolas" w:eastAsia="Consolas"/>
+          <w:sz w:val="15"/>
+        </w:rPr>
+        <w:t xml:space="preserve">            nrow(cm), ncol(cm)))</w:t>
+      </w:r>
+    </w:p>
+    <w:p>
+      <w:pPr>
+        <w:spacing w:after="0" w:before="0" w:line="240" w:lineRule="auto"/>
+      </w:pPr>
+      <w:r>
+        <w:rPr>
+          <w:rFonts w:ascii="Consolas" w:hAnsi="Consolas" w:eastAsia="Consolas"/>
+          <w:sz w:val="15"/>
+        </w:rPr>
+      </w:r>
+    </w:p>
+    <w:p>
+      <w:pPr>
+        <w:spacing w:after="0" w:before="0" w:line="240" w:lineRule="auto"/>
+      </w:pPr>
+      <w:r>
+        <w:rPr>
+          <w:rFonts w:ascii="Consolas" w:hAnsi="Consolas" w:eastAsia="Consolas"/>
+          <w:sz w:val="15"/>
+        </w:rPr>
+        <w:t># --- 3. 特征集：直接采用 EMP 实际保留的基因，避免猜测其过滤规则 --------------</w:t>
+      </w:r>
+    </w:p>
+    <w:p>
+      <w:pPr>
+        <w:spacing w:after="0" w:before="0" w:line="240" w:lineRule="auto"/>
+      </w:pPr>
+      <w:r>
+        <w:rPr>
+          <w:rFonts w:ascii="Consolas" w:hAnsi="Consolas" w:eastAsia="Consolas"/>
+          <w:sz w:val="15"/>
+        </w:rPr>
+        <w:t>assay_emp &lt;- read.csv(file.path(W5, "RNAseq_output_assay.csv"),</w:t>
+      </w:r>
+    </w:p>
+    <w:p>
+      <w:pPr>
+        <w:spacing w:after="0" w:before="0" w:line="240" w:lineRule="auto"/>
+      </w:pPr>
+      <w:r>
+        <w:rPr>
+          <w:rFonts w:ascii="Consolas" w:hAnsi="Consolas" w:eastAsia="Consolas"/>
+          <w:sz w:val="15"/>
+        </w:rPr>
+        <w:t xml:space="preserve">                      row.names = 1, check.names = FALSE)</w:t>
+      </w:r>
+    </w:p>
+    <w:p>
+      <w:pPr>
+        <w:spacing w:after="0" w:before="0" w:line="240" w:lineRule="auto"/>
+      </w:pPr>
+      <w:r>
+        <w:rPr>
+          <w:rFonts w:ascii="Consolas" w:hAnsi="Consolas" w:eastAsia="Consolas"/>
+          <w:sz w:val="15"/>
+        </w:rPr>
+        <w:t>keep_genes &lt;- rownames(assay_emp)</w:t>
+      </w:r>
+    </w:p>
+    <w:p>
+      <w:pPr>
+        <w:spacing w:after="0" w:before="0" w:line="240" w:lineRule="auto"/>
+      </w:pPr>
+      <w:r>
+        <w:rPr>
+          <w:rFonts w:ascii="Consolas" w:hAnsi="Consolas" w:eastAsia="Consolas"/>
+          <w:sz w:val="15"/>
+        </w:rPr>
+        <w:t>stopifnot(all(keep_genes %in% rownames(cm)))</w:t>
+      </w:r>
+    </w:p>
+    <w:p>
+      <w:pPr>
+        <w:spacing w:after="0" w:before="0" w:line="240" w:lineRule="auto"/>
+      </w:pPr>
+      <w:r>
+        <w:rPr>
+          <w:rFonts w:ascii="Consolas" w:hAnsi="Consolas" w:eastAsia="Consolas"/>
+          <w:sz w:val="15"/>
+        </w:rPr>
+        <w:t>cm &lt;- cm[keep_genes, , drop = FALSE]</w:t>
+      </w:r>
+    </w:p>
+    <w:p>
+      <w:pPr>
+        <w:spacing w:after="0" w:before="0" w:line="240" w:lineRule="auto"/>
+      </w:pPr>
+      <w:r>
+        <w:rPr>
+          <w:rFonts w:ascii="Consolas" w:hAnsi="Consolas" w:eastAsia="Consolas"/>
+          <w:sz w:val="15"/>
+        </w:rPr>
+        <w:t>cat(sprintf("特征集: 采用 EMP 保留的 %d 个基因（从平台导出的 assay 读取，非本脚本重新过滤）\n",</w:t>
+      </w:r>
+    </w:p>
+    <w:p>
+      <w:pPr>
+        <w:spacing w:after="0" w:before="0" w:line="240" w:lineRule="auto"/>
+      </w:pPr>
+      <w:r>
+        <w:rPr>
+          <w:rFonts w:ascii="Consolas" w:hAnsi="Consolas" w:eastAsia="Consolas"/>
+          <w:sz w:val="15"/>
+        </w:rPr>
+        <w:t xml:space="preserve">            nrow(cm)))</w:t>
+      </w:r>
+    </w:p>
+    <w:p>
+      <w:pPr>
+        <w:spacing w:after="0" w:before="0" w:line="240" w:lineRule="auto"/>
+      </w:pPr>
+      <w:r>
+        <w:rPr>
+          <w:rFonts w:ascii="Consolas" w:hAnsi="Consolas" w:eastAsia="Consolas"/>
+          <w:sz w:val="15"/>
+        </w:rPr>
+      </w:r>
+    </w:p>
+    <w:p>
+      <w:pPr>
+        <w:spacing w:after="0" w:before="0" w:line="240" w:lineRule="auto"/>
+      </w:pPr>
+      <w:r>
+        <w:rPr>
+          <w:rFonts w:ascii="Consolas" w:hAnsi="Consolas" w:eastAsia="Consolas"/>
+          <w:sz w:val="15"/>
+        </w:rPr>
+        <w:t>meta$Group &lt;- factor(meta$Group)</w:t>
+      </w:r>
+    </w:p>
+    <w:p>
+      <w:pPr>
+        <w:spacing w:after="0" w:before="0" w:line="240" w:lineRule="auto"/>
+      </w:pPr>
+      <w:r>
+        <w:rPr>
+          <w:rFonts w:ascii="Consolas" w:hAnsi="Consolas" w:eastAsia="Consolas"/>
+          <w:sz w:val="15"/>
+        </w:rPr>
+        <w:t>cat("\n分组结构:\n"); print(table(meta$Group))</w:t>
+      </w:r>
+    </w:p>
+    <w:p>
+      <w:pPr>
+        <w:spacing w:after="0" w:before="0" w:line="240" w:lineRule="auto"/>
+      </w:pPr>
+      <w:r>
+        <w:rPr>
+          <w:rFonts w:ascii="Consolas" w:hAnsi="Consolas" w:eastAsia="Consolas"/>
+          <w:sz w:val="15"/>
+        </w:rPr>
+      </w:r>
+    </w:p>
+    <w:p>
+      <w:pPr>
+        <w:spacing w:after="0" w:before="0" w:line="240" w:lineRule="auto"/>
+      </w:pPr>
+      <w:r>
+        <w:rPr>
+          <w:rFonts w:ascii="Consolas" w:hAnsi="Consolas" w:eastAsia="Consolas"/>
+          <w:sz w:val="15"/>
+        </w:rPr>
+        <w:t># =============================================================================</w:t>
+      </w:r>
+    </w:p>
+    <w:p>
+      <w:pPr>
+        <w:spacing w:after="0" w:before="0" w:line="240" w:lineRule="auto"/>
+      </w:pPr>
+      <w:r>
+        <w:rPr>
+          <w:rFonts w:ascii="Consolas" w:hAnsi="Consolas" w:eastAsia="Consolas"/>
+          <w:sz w:val="15"/>
+        </w:rPr>
+        <w:t># 4. PCA —— 全部 24 个样本，展示整个析因设计的结构</w:t>
+      </w:r>
+    </w:p>
+    <w:p>
+      <w:pPr>
+        <w:spacing w:after="0" w:before="0" w:line="240" w:lineRule="auto"/>
+      </w:pPr>
+      <w:r>
+        <w:rPr>
+          <w:rFonts w:ascii="Consolas" w:hAnsi="Consolas" w:eastAsia="Consolas"/>
+          <w:sz w:val="15"/>
+        </w:rPr>
+        <w:t># =============================================================================</w:t>
+      </w:r>
+    </w:p>
+    <w:p>
+      <w:pPr>
+        <w:spacing w:after="0" w:before="0" w:line="240" w:lineRule="auto"/>
+      </w:pPr>
+      <w:r>
+        <w:rPr>
+          <w:rFonts w:ascii="Consolas" w:hAnsi="Consolas" w:eastAsia="Consolas"/>
+          <w:sz w:val="15"/>
+        </w:rPr>
+        <w:t>dds_all &lt;- DESeqDataSetFromMatrix(cm, meta, design = ~ Group)</w:t>
+      </w:r>
+    </w:p>
+    <w:p>
+      <w:pPr>
+        <w:spacing w:after="0" w:before="0" w:line="240" w:lineRule="auto"/>
+      </w:pPr>
+      <w:r>
+        <w:rPr>
+          <w:rFonts w:ascii="Consolas" w:hAnsi="Consolas" w:eastAsia="Consolas"/>
+          <w:sz w:val="15"/>
+        </w:rPr>
+        <w:t>vsd &lt;- vst(dds_all, blind = TRUE)</w:t>
+      </w:r>
+    </w:p>
+    <w:p>
+      <w:pPr>
+        <w:spacing w:after="0" w:before="0" w:line="240" w:lineRule="auto"/>
+      </w:pPr>
+      <w:r>
+        <w:rPr>
+          <w:rFonts w:ascii="Consolas" w:hAnsi="Consolas" w:eastAsia="Consolas"/>
+          <w:sz w:val="15"/>
+        </w:rPr>
+      </w:r>
+    </w:p>
+    <w:p>
+      <w:pPr>
+        <w:spacing w:after="0" w:before="0" w:line="240" w:lineRule="auto"/>
+      </w:pPr>
+      <w:r>
+        <w:rPr>
+          <w:rFonts w:ascii="Consolas" w:hAnsi="Consolas" w:eastAsia="Consolas"/>
+          <w:sz w:val="15"/>
+        </w:rPr>
+        <w:t>pca &lt;- prcomp(t(assay(vsd)), scale. = FALSE)</w:t>
+      </w:r>
+    </w:p>
+    <w:p>
+      <w:pPr>
+        <w:spacing w:after="0" w:before="0" w:line="240" w:lineRule="auto"/>
+      </w:pPr>
+      <w:r>
+        <w:rPr>
+          <w:rFonts w:ascii="Consolas" w:hAnsi="Consolas" w:eastAsia="Consolas"/>
+          <w:sz w:val="15"/>
+        </w:rPr>
+        <w:t>pv  &lt;- round(100 * pca$sdev^2 / sum(pca$sdev^2), 1)</w:t>
+      </w:r>
+    </w:p>
+    <w:p>
+      <w:pPr>
+        <w:spacing w:after="0" w:before="0" w:line="240" w:lineRule="auto"/>
+      </w:pPr>
+      <w:r>
+        <w:rPr>
+          <w:rFonts w:ascii="Consolas" w:hAnsi="Consolas" w:eastAsia="Consolas"/>
+          <w:sz w:val="15"/>
+        </w:rPr>
+        <w:t>pdat &lt;- data.frame(PC1 = pca$x[, 1], PC2 = pca$x[, 2],</w:t>
+      </w:r>
+    </w:p>
+    <w:p>
+      <w:pPr>
+        <w:spacing w:after="0" w:before="0" w:line="240" w:lineRule="auto"/>
+      </w:pPr>
+      <w:r>
+        <w:rPr>
+          <w:rFonts w:ascii="Consolas" w:hAnsi="Consolas" w:eastAsia="Consolas"/>
+          <w:sz w:val="15"/>
+        </w:rPr>
+        <w:t xml:space="preserve">                   Group = meta$Group, Sample = rownames(meta))</w:t>
+      </w:r>
+    </w:p>
+    <w:p>
+      <w:pPr>
+        <w:spacing w:after="0" w:before="0" w:line="240" w:lineRule="auto"/>
+      </w:pPr>
+      <w:r>
+        <w:rPr>
+          <w:rFonts w:ascii="Consolas" w:hAnsi="Consolas" w:eastAsia="Consolas"/>
+          <w:sz w:val="15"/>
+        </w:rPr>
+        <w:t>pdat$Drug  &lt;- sub("\\+LIPUS$", "", as.character(pdat$Group))</w:t>
+      </w:r>
+    </w:p>
+    <w:p>
+      <w:pPr>
+        <w:spacing w:after="0" w:before="0" w:line="240" w:lineRule="auto"/>
+      </w:pPr>
+      <w:r>
+        <w:rPr>
+          <w:rFonts w:ascii="Consolas" w:hAnsi="Consolas" w:eastAsia="Consolas"/>
+          <w:sz w:val="15"/>
+        </w:rPr>
+        <w:t>pdat$LIPUS &lt;- ifelse(grepl("\\+LIPUS$", pdat$Group), "LIPUS", "no LIPUS")</w:t>
+      </w:r>
+    </w:p>
+    <w:p>
+      <w:pPr>
+        <w:spacing w:after="0" w:before="0" w:line="240" w:lineRule="auto"/>
+      </w:pPr>
+      <w:r>
+        <w:rPr>
+          <w:rFonts w:ascii="Consolas" w:hAnsi="Consolas" w:eastAsia="Consolas"/>
+          <w:sz w:val="15"/>
+        </w:rPr>
+      </w:r>
+    </w:p>
+    <w:p>
+      <w:pPr>
+        <w:spacing w:after="0" w:before="0" w:line="240" w:lineRule="auto"/>
+      </w:pPr>
+      <w:r>
+        <w:rPr>
+          <w:rFonts w:ascii="Consolas" w:hAnsi="Consolas" w:eastAsia="Consolas"/>
+          <w:sz w:val="15"/>
+        </w:rPr>
+        <w:t>p_pca &lt;- ggplot(pdat, aes(PC1, PC2, colour = Drug, shape = LIPUS)) +</w:t>
+      </w:r>
+    </w:p>
+    <w:p>
+      <w:pPr>
+        <w:spacing w:after="0" w:before="0" w:line="240" w:lineRule="auto"/>
+      </w:pPr>
+      <w:r>
+        <w:rPr>
+          <w:rFonts w:ascii="Consolas" w:hAnsi="Consolas" w:eastAsia="Consolas"/>
+          <w:sz w:val="15"/>
+        </w:rPr>
+        <w:t xml:space="preserve">  geom_point(size = 3.6, alpha = .9) +</w:t>
+      </w:r>
+    </w:p>
+    <w:p>
+      <w:pPr>
+        <w:spacing w:after="0" w:before="0" w:line="240" w:lineRule="auto"/>
+      </w:pPr>
+      <w:r>
+        <w:rPr>
+          <w:rFonts w:ascii="Consolas" w:hAnsi="Consolas" w:eastAsia="Consolas"/>
+          <w:sz w:val="15"/>
+        </w:rPr>
+        <w:t xml:space="preserve">  scale_colour_manual(values = c(DMSO = "#6B6478", T4400 = "#B4341F",</w:t>
+      </w:r>
+    </w:p>
+    <w:p>
+      <w:pPr>
+        <w:spacing w:after="0" w:before="0" w:line="240" w:lineRule="auto"/>
+      </w:pPr>
+      <w:r>
+        <w:rPr>
+          <w:rFonts w:ascii="Consolas" w:hAnsi="Consolas" w:eastAsia="Consolas"/>
+          <w:sz w:val="15"/>
+        </w:rPr>
+        <w:t xml:space="preserve">                                 T3976 = "#2F6F4E")) +</w:t>
+      </w:r>
+    </w:p>
+    <w:p>
+      <w:pPr>
+        <w:spacing w:after="0" w:before="0" w:line="240" w:lineRule="auto"/>
+      </w:pPr>
+      <w:r>
+        <w:rPr>
+          <w:rFonts w:ascii="Consolas" w:hAnsi="Consolas" w:eastAsia="Consolas"/>
+          <w:sz w:val="15"/>
+        </w:rPr>
+        <w:t xml:space="preserve">  labs(title = "PCA of VST-transformed counts (all 24 samples)",</w:t>
+      </w:r>
+    </w:p>
+    <w:p>
+      <w:pPr>
+        <w:spacing w:after="0" w:before="0" w:line="240" w:lineRule="auto"/>
+      </w:pPr>
+      <w:r>
+        <w:rPr>
+          <w:rFonts w:ascii="Consolas" w:hAnsi="Consolas" w:eastAsia="Consolas"/>
+          <w:sz w:val="15"/>
+        </w:rPr>
+        <w:t xml:space="preserve">       subtitle = sprintf("EMP-retained feature set, %d genes | rebuilt in R, not the platform's own output",</w:t>
+      </w:r>
+    </w:p>
+    <w:p>
+      <w:pPr>
+        <w:spacing w:after="0" w:before="0" w:line="240" w:lineRule="auto"/>
+      </w:pPr>
+      <w:r>
+        <w:rPr>
+          <w:rFonts w:ascii="Consolas" w:hAnsi="Consolas" w:eastAsia="Consolas"/>
+          <w:sz w:val="15"/>
+        </w:rPr>
+        <w:t xml:space="preserve">                          nrow(cm)),</w:t>
+      </w:r>
+    </w:p>
+    <w:p>
+      <w:pPr>
+        <w:spacing w:after="0" w:before="0" w:line="240" w:lineRule="auto"/>
+      </w:pPr>
+      <w:r>
+        <w:rPr>
+          <w:rFonts w:ascii="Consolas" w:hAnsi="Consolas" w:eastAsia="Consolas"/>
+          <w:sz w:val="15"/>
+        </w:rPr>
+        <w:t xml:space="preserve">       x = sprintf("PC1 (%.1f%%)", pv[1]), y = sprintf("PC2 (%.1f%%)", pv[2])) +</w:t>
+      </w:r>
+    </w:p>
+    <w:p>
+      <w:pPr>
+        <w:spacing w:after="0" w:before="0" w:line="240" w:lineRule="auto"/>
+      </w:pPr>
+      <w:r>
+        <w:rPr>
+          <w:rFonts w:ascii="Consolas" w:hAnsi="Consolas" w:eastAsia="Consolas"/>
+          <w:sz w:val="15"/>
+        </w:rPr>
+        <w:t xml:space="preserve">  theme_minimal(base_size = 11) +</w:t>
+      </w:r>
+    </w:p>
+    <w:p>
+      <w:pPr>
+        <w:spacing w:after="0" w:before="0" w:line="240" w:lineRule="auto"/>
+      </w:pPr>
+      <w:r>
+        <w:rPr>
+          <w:rFonts w:ascii="Consolas" w:hAnsi="Consolas" w:eastAsia="Consolas"/>
+          <w:sz w:val="15"/>
+        </w:rPr>
+        <w:t xml:space="preserve">  theme(plot.title = element_text(face = "bold"),</w:t>
+      </w:r>
+    </w:p>
+    <w:p>
+      <w:pPr>
+        <w:spacing w:after="0" w:before="0" w:line="240" w:lineRule="auto"/>
+      </w:pPr>
+      <w:r>
+        <w:rPr>
+          <w:rFonts w:ascii="Consolas" w:hAnsi="Consolas" w:eastAsia="Consolas"/>
+          <w:sz w:val="15"/>
+        </w:rPr>
+        <w:t xml:space="preserve">        legend.position = "right")</w:t>
+      </w:r>
+    </w:p>
+    <w:p>
+      <w:pPr>
+        <w:spacing w:after="0" w:before="0" w:line="240" w:lineRule="auto"/>
+      </w:pPr>
+      <w:r>
+        <w:rPr>
+          <w:rFonts w:ascii="Consolas" w:hAnsi="Consolas" w:eastAsia="Consolas"/>
+          <w:sz w:val="15"/>
+        </w:rPr>
+        <w:t>ggsave(file.path(OUT, "hw2_pca_all24.png"), p_pca,</w:t>
+      </w:r>
+    </w:p>
+    <w:p>
+      <w:pPr>
+        <w:spacing w:after="0" w:before="0" w:line="240" w:lineRule="auto"/>
+      </w:pPr>
+      <w:r>
+        <w:rPr>
+          <w:rFonts w:ascii="Consolas" w:hAnsi="Consolas" w:eastAsia="Consolas"/>
+          <w:sz w:val="15"/>
+        </w:rPr>
+        <w:t xml:space="preserve">       width = 8.2, height = 5.4, dpi = 200, bg = "white")</w:t>
+      </w:r>
+    </w:p>
+    <w:p>
+      <w:pPr>
+        <w:spacing w:after="0" w:before="0" w:line="240" w:lineRule="auto"/>
+      </w:pPr>
+      <w:r>
+        <w:rPr>
+          <w:rFonts w:ascii="Consolas" w:hAnsi="Consolas" w:eastAsia="Consolas"/>
+          <w:sz w:val="15"/>
+        </w:rPr>
+        <w:t>write.csv(cbind(pdat, pca$x[, 1:4]), file.path(OUT, "hw2_pca_coordinates.csv"),</w:t>
+      </w:r>
+    </w:p>
+    <w:p>
+      <w:pPr>
+        <w:spacing w:after="0" w:before="0" w:line="240" w:lineRule="auto"/>
+      </w:pPr>
+      <w:r>
+        <w:rPr>
+          <w:rFonts w:ascii="Consolas" w:hAnsi="Consolas" w:eastAsia="Consolas"/>
+          <w:sz w:val="15"/>
+        </w:rPr>
+        <w:t xml:space="preserve">          row.names = FALSE)</w:t>
+      </w:r>
+    </w:p>
+    <w:p>
+      <w:pPr>
+        <w:spacing w:after="0" w:before="0" w:line="240" w:lineRule="auto"/>
+      </w:pPr>
+      <w:r>
+        <w:rPr>
+          <w:rFonts w:ascii="Consolas" w:hAnsi="Consolas" w:eastAsia="Consolas"/>
+          <w:sz w:val="15"/>
+        </w:rPr>
+        <w:t>cat(sprintf("\nPCA: PC1 %.1f%%, PC2 %.1f%%\n", pv[1], pv[2]))</w:t>
+      </w:r>
+    </w:p>
+    <w:p>
+      <w:pPr>
+        <w:spacing w:after="0" w:before="0" w:line="240" w:lineRule="auto"/>
+      </w:pPr>
+      <w:r>
+        <w:rPr>
+          <w:rFonts w:ascii="Consolas" w:hAnsi="Consolas" w:eastAsia="Consolas"/>
+          <w:sz w:val="15"/>
+        </w:rPr>
+      </w:r>
+    </w:p>
+    <w:p>
+      <w:pPr>
+        <w:spacing w:after="0" w:before="0" w:line="240" w:lineRule="auto"/>
+      </w:pPr>
+      <w:r>
+        <w:rPr>
+          <w:rFonts w:ascii="Consolas" w:hAnsi="Consolas" w:eastAsia="Consolas"/>
+          <w:sz w:val="15"/>
+        </w:rPr>
+        <w:t># =============================================================================</w:t>
+      </w:r>
+    </w:p>
+    <w:p>
+      <w:pPr>
+        <w:spacing w:after="0" w:before="0" w:line="240" w:lineRule="auto"/>
+      </w:pPr>
+      <w:r>
+        <w:rPr>
+          <w:rFonts w:ascii="Consolas" w:hAnsi="Consolas" w:eastAsia="Consolas"/>
+          <w:sz w:val="15"/>
+        </w:rPr>
+        <w:t># 5. 差异表达 —— T4400 vs DMSO，参考水平 DMSO（与平台上更正后的方向一致）</w:t>
+      </w:r>
+    </w:p>
+    <w:p>
+      <w:pPr>
+        <w:spacing w:after="0" w:before="0" w:line="240" w:lineRule="auto"/>
+      </w:pPr>
+      <w:r>
+        <w:rPr>
+          <w:rFonts w:ascii="Consolas" w:hAnsi="Consolas" w:eastAsia="Consolas"/>
+          <w:sz w:val="15"/>
+        </w:rPr>
+        <w:t># =============================================================================</w:t>
+      </w:r>
+    </w:p>
+    <w:p>
+      <w:pPr>
+        <w:spacing w:after="0" w:before="0" w:line="240" w:lineRule="auto"/>
+      </w:pPr>
+      <w:r>
+        <w:rPr>
+          <w:rFonts w:ascii="Consolas" w:hAnsi="Consolas" w:eastAsia="Consolas"/>
+          <w:sz w:val="15"/>
+        </w:rPr>
+        <w:t>sel  &lt;- meta$Group %in% c("DMSO", "T4400")</w:t>
+      </w:r>
+    </w:p>
+    <w:p>
+      <w:pPr>
+        <w:spacing w:after="0" w:before="0" w:line="240" w:lineRule="auto"/>
+      </w:pPr>
+      <w:r>
+        <w:rPr>
+          <w:rFonts w:ascii="Consolas" w:hAnsi="Consolas" w:eastAsia="Consolas"/>
+          <w:sz w:val="15"/>
+        </w:rPr>
+        <w:t>meta_sub &lt;- droplevels(meta[sel, , drop = FALSE])</w:t>
+      </w:r>
+    </w:p>
+    <w:p>
+      <w:pPr>
+        <w:spacing w:after="0" w:before="0" w:line="240" w:lineRule="auto"/>
+      </w:pPr>
+      <w:r>
+        <w:rPr>
+          <w:rFonts w:ascii="Consolas" w:hAnsi="Consolas" w:eastAsia="Consolas"/>
+          <w:sz w:val="15"/>
+        </w:rPr>
+        <w:t>meta_sub$Group &lt;- relevel(factor(meta_sub$Group), ref = "DMSO")</w:t>
+      </w:r>
+    </w:p>
+    <w:p>
+      <w:pPr>
+        <w:spacing w:after="0" w:before="0" w:line="240" w:lineRule="auto"/>
+      </w:pPr>
+      <w:r>
+        <w:rPr>
+          <w:rFonts w:ascii="Consolas" w:hAnsi="Consolas" w:eastAsia="Consolas"/>
+          <w:sz w:val="15"/>
+        </w:rPr>
+        <w:t>cm_sub &lt;- cm[, rownames(meta_sub), drop = FALSE]</w:t>
+      </w:r>
+    </w:p>
+    <w:p>
+      <w:pPr>
+        <w:spacing w:after="0" w:before="0" w:line="240" w:lineRule="auto"/>
+      </w:pPr>
+      <w:r>
+        <w:rPr>
+          <w:rFonts w:ascii="Consolas" w:hAnsi="Consolas" w:eastAsia="Consolas"/>
+          <w:sz w:val="15"/>
+        </w:rPr>
+      </w:r>
+    </w:p>
+    <w:p>
+      <w:pPr>
+        <w:spacing w:after="0" w:before="0" w:line="240" w:lineRule="auto"/>
+      </w:pPr>
+      <w:r>
+        <w:rPr>
+          <w:rFonts w:ascii="Consolas" w:hAnsi="Consolas" w:eastAsia="Consolas"/>
+          <w:sz w:val="15"/>
+        </w:rPr>
+        <w:t>cat(sprintf("\n差异分析子集: %d 样本 (%s)\n", ncol(cm_sub),</w:t>
+      </w:r>
+    </w:p>
+    <w:p>
+      <w:pPr>
+        <w:spacing w:after="0" w:before="0" w:line="240" w:lineRule="auto"/>
+      </w:pPr>
+      <w:r>
+        <w:rPr>
+          <w:rFonts w:ascii="Consolas" w:hAnsi="Consolas" w:eastAsia="Consolas"/>
+          <w:sz w:val="15"/>
+        </w:rPr>
+        <w:t xml:space="preserve">            paste(names(table(meta_sub$Group)), table(meta_sub$Group),</w:t>
+      </w:r>
+    </w:p>
+    <w:p>
+      <w:pPr>
+        <w:spacing w:after="0" w:before="0" w:line="240" w:lineRule="auto"/>
+      </w:pPr>
+      <w:r>
+        <w:rPr>
+          <w:rFonts w:ascii="Consolas" w:hAnsi="Consolas" w:eastAsia="Consolas"/>
+          <w:sz w:val="15"/>
+        </w:rPr>
+        <w:t xml:space="preserve">                  sep = "=", collapse = ", ")))</w:t>
+      </w:r>
+    </w:p>
+    <w:p>
+      <w:pPr>
+        <w:spacing w:after="0" w:before="0" w:line="240" w:lineRule="auto"/>
+      </w:pPr>
+      <w:r>
+        <w:rPr>
+          <w:rFonts w:ascii="Consolas" w:hAnsi="Consolas" w:eastAsia="Consolas"/>
+          <w:sz w:val="15"/>
+        </w:rPr>
+      </w:r>
+    </w:p>
+    <w:p>
+      <w:pPr>
+        <w:spacing w:after="0" w:before="0" w:line="240" w:lineRule="auto"/>
+      </w:pPr>
+      <w:r>
+        <w:rPr>
+          <w:rFonts w:ascii="Consolas" w:hAnsi="Consolas" w:eastAsia="Consolas"/>
+          <w:sz w:val="15"/>
+        </w:rPr>
+        <w:t>dds &lt;- DESeqDataSetFromMatrix(cm_sub, meta_sub, design = ~ Group)</w:t>
+      </w:r>
+    </w:p>
+    <w:p>
+      <w:pPr>
+        <w:spacing w:after="0" w:before="0" w:line="240" w:lineRule="auto"/>
+      </w:pPr>
+      <w:r>
+        <w:rPr>
+          <w:rFonts w:ascii="Consolas" w:hAnsi="Consolas" w:eastAsia="Consolas"/>
+          <w:sz w:val="15"/>
+        </w:rPr>
+        <w:t>mm  &lt;- model.matrix(design(dds), colData(dds))</w:t>
+      </w:r>
+    </w:p>
+    <w:p>
+      <w:pPr>
+        <w:spacing w:after="0" w:before="0" w:line="240" w:lineRule="auto"/>
+      </w:pPr>
+      <w:r>
+        <w:rPr>
+          <w:rFonts w:ascii="Consolas" w:hAnsi="Consolas" w:eastAsia="Consolas"/>
+          <w:sz w:val="15"/>
+        </w:rPr>
+        <w:t>stopifnot(qr(mm)$rank == ncol(mm))                     # 满秩检查</w:t>
+      </w:r>
+    </w:p>
+    <w:p>
+      <w:pPr>
+        <w:spacing w:after="0" w:before="0" w:line="240" w:lineRule="auto"/>
+      </w:pPr>
+      <w:r>
+        <w:rPr>
+          <w:rFonts w:ascii="Consolas" w:hAnsi="Consolas" w:eastAsia="Consolas"/>
+          <w:sz w:val="15"/>
+        </w:rPr>
+        <w:t>cat(sprintf("模型矩阵满秩: %d/%d\n", qr(mm)$rank, ncol(mm)))</w:t>
+      </w:r>
+    </w:p>
+    <w:p>
+      <w:pPr>
+        <w:spacing w:after="0" w:before="0" w:line="240" w:lineRule="auto"/>
+      </w:pPr>
+      <w:r>
+        <w:rPr>
+          <w:rFonts w:ascii="Consolas" w:hAnsi="Consolas" w:eastAsia="Consolas"/>
+          <w:sz w:val="15"/>
+        </w:rPr>
+      </w:r>
+    </w:p>
+    <w:p>
+      <w:pPr>
+        <w:spacing w:after="0" w:before="0" w:line="240" w:lineRule="auto"/>
+      </w:pPr>
+      <w:r>
+        <w:rPr>
+          <w:rFonts w:ascii="Consolas" w:hAnsi="Consolas" w:eastAsia="Consolas"/>
+          <w:sz w:val="15"/>
+        </w:rPr>
+        <w:t>dds &lt;- DESeq(dds, quiet = TRUE)</w:t>
+      </w:r>
+    </w:p>
+    <w:p>
+      <w:pPr>
+        <w:spacing w:after="0" w:before="0" w:line="240" w:lineRule="auto"/>
+      </w:pPr>
+      <w:r>
+        <w:rPr>
+          <w:rFonts w:ascii="Consolas" w:hAnsi="Consolas" w:eastAsia="Consolas"/>
+          <w:sz w:val="15"/>
+        </w:rPr>
+        <w:t>cat("resultsNames: ", paste(resultsNames(dds), collapse = " | "), "\n")</w:t>
+      </w:r>
+    </w:p>
+    <w:p>
+      <w:pPr>
+        <w:spacing w:after="0" w:before="0" w:line="240" w:lineRule="auto"/>
+      </w:pPr>
+      <w:r>
+        <w:rPr>
+          <w:rFonts w:ascii="Consolas" w:hAnsi="Consolas" w:eastAsia="Consolas"/>
+          <w:sz w:val="15"/>
+        </w:rPr>
+      </w:r>
+    </w:p>
+    <w:p>
+      <w:pPr>
+        <w:spacing w:after="0" w:before="0" w:line="240" w:lineRule="auto"/>
+      </w:pPr>
+      <w:r>
+        <w:rPr>
+          <w:rFonts w:ascii="Consolas" w:hAnsi="Consolas" w:eastAsia="Consolas"/>
+          <w:sz w:val="15"/>
+        </w:rPr>
+        <w:t>coef_name &lt;- "Group_T4400_vs_DMSO"</w:t>
+      </w:r>
+    </w:p>
+    <w:p>
+      <w:pPr>
+        <w:spacing w:after="0" w:before="0" w:line="240" w:lineRule="auto"/>
+      </w:pPr>
+      <w:r>
+        <w:rPr>
+          <w:rFonts w:ascii="Consolas" w:hAnsi="Consolas" w:eastAsia="Consolas"/>
+          <w:sz w:val="15"/>
+        </w:rPr>
+        <w:t>stopifnot(coef_name %in% resultsNames(dds))            # 不假设系数名，显式核对</w:t>
+      </w:r>
+    </w:p>
+    <w:p>
+      <w:pPr>
+        <w:spacing w:after="0" w:before="0" w:line="240" w:lineRule="auto"/>
+      </w:pPr>
+      <w:r>
+        <w:rPr>
+          <w:rFonts w:ascii="Consolas" w:hAnsi="Consolas" w:eastAsia="Consolas"/>
+          <w:sz w:val="15"/>
+        </w:rPr>
+        <w:t>res &lt;- results(dds, name = coef_name)</w:t>
+      </w:r>
+    </w:p>
+    <w:p>
+      <w:pPr>
+        <w:spacing w:after="0" w:before="0" w:line="240" w:lineRule="auto"/>
+      </w:pPr>
+      <w:r>
+        <w:rPr>
+          <w:rFonts w:ascii="Consolas" w:hAnsi="Consolas" w:eastAsia="Consolas"/>
+          <w:sz w:val="15"/>
+        </w:rPr>
+        <w:t>res_shr &lt;- lfcShrink(dds, coef = coef_name, type = "apeglm", quiet = TRUE)</w:t>
+      </w:r>
+    </w:p>
+    <w:p>
+      <w:pPr>
+        <w:spacing w:after="0" w:before="0" w:line="240" w:lineRule="auto"/>
+      </w:pPr>
+      <w:r>
+        <w:rPr>
+          <w:rFonts w:ascii="Consolas" w:hAnsi="Consolas" w:eastAsia="Consolas"/>
+          <w:sz w:val="15"/>
+        </w:rPr>
+      </w:r>
+    </w:p>
+    <w:p>
+      <w:pPr>
+        <w:spacing w:after="0" w:before="0" w:line="240" w:lineRule="auto"/>
+      </w:pPr>
+      <w:r>
+        <w:rPr>
+          <w:rFonts w:ascii="Consolas" w:hAnsi="Consolas" w:eastAsia="Consolas"/>
+          <w:sz w:val="15"/>
+        </w:rPr>
+        <w:t>PADJ &lt;- 0.05; LFC &lt;- 1</w:t>
+      </w:r>
+    </w:p>
+    <w:p>
+      <w:pPr>
+        <w:spacing w:after="0" w:before="0" w:line="240" w:lineRule="auto"/>
+      </w:pPr>
+      <w:r>
+        <w:rPr>
+          <w:rFonts w:ascii="Consolas" w:hAnsi="Consolas" w:eastAsia="Consolas"/>
+          <w:sz w:val="15"/>
+        </w:rPr>
+        <w:t>rdf &lt;- as.data.frame(res_shr)</w:t>
+      </w:r>
+    </w:p>
+    <w:p>
+      <w:pPr>
+        <w:spacing w:after="0" w:before="0" w:line="240" w:lineRule="auto"/>
+      </w:pPr>
+      <w:r>
+        <w:rPr>
+          <w:rFonts w:ascii="Consolas" w:hAnsi="Consolas" w:eastAsia="Consolas"/>
+          <w:sz w:val="15"/>
+        </w:rPr>
+        <w:t>rdf$feature &lt;- rownames(rdf)</w:t>
+      </w:r>
+    </w:p>
+    <w:p>
+      <w:pPr>
+        <w:spacing w:after="0" w:before="0" w:line="240" w:lineRule="auto"/>
+      </w:pPr>
+      <w:r>
+        <w:rPr>
+          <w:rFonts w:ascii="Consolas" w:hAnsi="Consolas" w:eastAsia="Consolas"/>
+          <w:sz w:val="15"/>
+        </w:rPr>
+        <w:t>rdf &lt;- rdf[order(rdf$padj, na.last = TRUE), ]</w:t>
+      </w:r>
+    </w:p>
+    <w:p>
+      <w:pPr>
+        <w:spacing w:after="0" w:before="0" w:line="240" w:lineRule="auto"/>
+      </w:pPr>
+      <w:r>
+        <w:rPr>
+          <w:rFonts w:ascii="Consolas" w:hAnsi="Consolas" w:eastAsia="Consolas"/>
+          <w:sz w:val="15"/>
+        </w:rPr>
+        <w:t>rdf$significant &lt;- with(rdf, !is.na(padj) &amp; padj &lt; PADJ &amp; abs(log2FoldChange) &gt;= LFC)</w:t>
+      </w:r>
+    </w:p>
+    <w:p>
+      <w:pPr>
+        <w:spacing w:after="0" w:before="0" w:line="240" w:lineRule="auto"/>
+      </w:pPr>
+      <w:r>
+        <w:rPr>
+          <w:rFonts w:ascii="Consolas" w:hAnsi="Consolas" w:eastAsia="Consolas"/>
+          <w:sz w:val="15"/>
+        </w:rPr>
+        <w:t>rdf$direction &lt;- with(rdf, ifelse(!significant, "ns",</w:t>
+      </w:r>
+    </w:p>
+    <w:p>
+      <w:pPr>
+        <w:spacing w:after="0" w:before="0" w:line="240" w:lineRule="auto"/>
+      </w:pPr>
+      <w:r>
+        <w:rPr>
+          <w:rFonts w:ascii="Consolas" w:hAnsi="Consolas" w:eastAsia="Consolas"/>
+          <w:sz w:val="15"/>
+        </w:rPr>
+        <w:t xml:space="preserve">                           ifelse(log2FoldChange &gt; 0, "up in T4400", "down in T4400")))</w:t>
+      </w:r>
+    </w:p>
+    <w:p>
+      <w:pPr>
+        <w:spacing w:after="0" w:before="0" w:line="240" w:lineRule="auto"/>
+      </w:pPr>
+      <w:r>
+        <w:rPr>
+          <w:rFonts w:ascii="Consolas" w:hAnsi="Consolas" w:eastAsia="Consolas"/>
+          <w:sz w:val="15"/>
+        </w:rPr>
+      </w:r>
+    </w:p>
+    <w:p>
+      <w:pPr>
+        <w:spacing w:after="0" w:before="0" w:line="240" w:lineRule="auto"/>
+      </w:pPr>
+      <w:r>
+        <w:rPr>
+          <w:rFonts w:ascii="Consolas" w:hAnsi="Consolas" w:eastAsia="Consolas"/>
+          <w:sz w:val="15"/>
+        </w:rPr>
+        <w:t>n_up   &lt;- sum(rdf$direction == "up in T4400")</w:t>
+      </w:r>
+    </w:p>
+    <w:p>
+      <w:pPr>
+        <w:spacing w:after="0" w:before="0" w:line="240" w:lineRule="auto"/>
+      </w:pPr>
+      <w:r>
+        <w:rPr>
+          <w:rFonts w:ascii="Consolas" w:hAnsi="Consolas" w:eastAsia="Consolas"/>
+          <w:sz w:val="15"/>
+        </w:rPr>
+        <w:t>n_down &lt;- sum(rdf$direction == "down in T4400")</w:t>
+      </w:r>
+    </w:p>
+    <w:p>
+      <w:pPr>
+        <w:spacing w:after="0" w:before="0" w:line="240" w:lineRule="auto"/>
+      </w:pPr>
+      <w:r>
+        <w:rPr>
+          <w:rFonts w:ascii="Consolas" w:hAnsi="Consolas" w:eastAsia="Consolas"/>
+          <w:sz w:val="15"/>
+        </w:rPr>
+        <w:t>n_na   &lt;- sum(is.na(rdf$padj))</w:t>
+      </w:r>
+    </w:p>
+    <w:p>
+      <w:pPr>
+        <w:spacing w:after="0" w:before="0" w:line="240" w:lineRule="auto"/>
+      </w:pPr>
+      <w:r>
+        <w:rPr>
+          <w:rFonts w:ascii="Consolas" w:hAnsi="Consolas" w:eastAsia="Consolas"/>
+          <w:sz w:val="15"/>
+        </w:rPr>
+        <w:t>n_padj_only &lt;- sum(!is.na(rdf$padj) &amp; rdf$padj &lt; PADJ &amp; abs(rdf$log2FoldChange) &lt; LFC)</w:t>
+      </w:r>
+    </w:p>
+    <w:p>
+      <w:pPr>
+        <w:spacing w:after="0" w:before="0" w:line="240" w:lineRule="auto"/>
+      </w:pPr>
+      <w:r>
+        <w:rPr>
+          <w:rFonts w:ascii="Consolas" w:hAnsi="Consolas" w:eastAsia="Consolas"/>
+          <w:sz w:val="15"/>
+        </w:rPr>
+      </w:r>
+    </w:p>
+    <w:p>
+      <w:pPr>
+        <w:spacing w:after="0" w:before="0" w:line="240" w:lineRule="auto"/>
+      </w:pPr>
+      <w:r>
+        <w:rPr>
+          <w:rFonts w:ascii="Consolas" w:hAnsi="Consolas" w:eastAsia="Consolas"/>
+          <w:sz w:val="15"/>
+        </w:rPr>
+        <w:t>cat(sprintf("\n阈值 padj &lt; %.2f 且 |log2FC| &gt;= %g\n", PADJ, LFC))</w:t>
+      </w:r>
+    </w:p>
+    <w:p>
+      <w:pPr>
+        <w:spacing w:after="0" w:before="0" w:line="240" w:lineRule="auto"/>
+      </w:pPr>
+      <w:r>
+        <w:rPr>
+          <w:rFonts w:ascii="Consolas" w:hAnsi="Consolas" w:eastAsia="Consolas"/>
+          <w:sz w:val="15"/>
+        </w:rPr>
+        <w:t>cat(sprintf("  上调 (T4400 更高): %d\n", n_up))</w:t>
+      </w:r>
+    </w:p>
+    <w:p>
+      <w:pPr>
+        <w:spacing w:after="0" w:before="0" w:line="240" w:lineRule="auto"/>
+      </w:pPr>
+      <w:r>
+        <w:rPr>
+          <w:rFonts w:ascii="Consolas" w:hAnsi="Consolas" w:eastAsia="Consolas"/>
+          <w:sz w:val="15"/>
+        </w:rPr>
+        <w:t>cat(sprintf("  下调 (T4400 更低): %d\n", n_down))</w:t>
+      </w:r>
+    </w:p>
+    <w:p>
+      <w:pPr>
+        <w:spacing w:after="0" w:before="0" w:line="240" w:lineRule="auto"/>
+      </w:pPr>
+      <w:r>
+        <w:rPr>
+          <w:rFonts w:ascii="Consolas" w:hAnsi="Consolas" w:eastAsia="Consolas"/>
+          <w:sz w:val="15"/>
+        </w:rPr>
+        <w:t>cat(sprintf("  合计显著          : %d\n", n_up + n_down))</w:t>
+      </w:r>
+    </w:p>
+    <w:p>
+      <w:pPr>
+        <w:spacing w:after="0" w:before="0" w:line="240" w:lineRule="auto"/>
+      </w:pPr>
+      <w:r>
+        <w:rPr>
+          <w:rFonts w:ascii="Consolas" w:hAnsi="Consolas" w:eastAsia="Consolas"/>
+          <w:sz w:val="15"/>
+        </w:rPr>
+        <w:t>cat(sprintf("  padj 为 NA        : %d\n", n_na))</w:t>
+      </w:r>
+    </w:p>
+    <w:p>
+      <w:pPr>
+        <w:spacing w:after="0" w:before="0" w:line="240" w:lineRule="auto"/>
+      </w:pPr>
+      <w:r>
+        <w:rPr>
+          <w:rFonts w:ascii="Consolas" w:hAnsi="Consolas" w:eastAsia="Consolas"/>
+          <w:sz w:val="15"/>
+        </w:rPr>
+        <w:t>cat(sprintf("  仅过 padj 未过效应量: %d\n", n_padj_only))</w:t>
+      </w:r>
+    </w:p>
+    <w:p>
+      <w:pPr>
+        <w:spacing w:after="0" w:before="0" w:line="240" w:lineRule="auto"/>
+      </w:pPr>
+      <w:r>
+        <w:rPr>
+          <w:rFonts w:ascii="Consolas" w:hAnsi="Consolas" w:eastAsia="Consolas"/>
+          <w:sz w:val="15"/>
+        </w:rPr>
+      </w:r>
+    </w:p>
+    <w:p>
+      <w:pPr>
+        <w:spacing w:after="0" w:before="0" w:line="240" w:lineRule="auto"/>
+      </w:pPr>
+      <w:r>
+        <w:rPr>
+          <w:rFonts w:ascii="Consolas" w:hAnsi="Consolas" w:eastAsia="Consolas"/>
+          <w:sz w:val="15"/>
+        </w:rPr>
+        <w:t>write.csv(rdf[, c("feature", "baseMean", "log2FoldChange", "lfcSE",</w:t>
+      </w:r>
+    </w:p>
+    <w:p>
+      <w:pPr>
+        <w:spacing w:after="0" w:before="0" w:line="240" w:lineRule="auto"/>
+      </w:pPr>
+      <w:r>
+        <w:rPr>
+          <w:rFonts w:ascii="Consolas" w:hAnsi="Consolas" w:eastAsia="Consolas"/>
+          <w:sz w:val="15"/>
+        </w:rPr>
+        <w:t xml:space="preserve">                  "pvalue", "padj", "significant", "direction")],</w:t>
+      </w:r>
+    </w:p>
+    <w:p>
+      <w:pPr>
+        <w:spacing w:after="0" w:before="0" w:line="240" w:lineRule="auto"/>
+      </w:pPr>
+      <w:r>
+        <w:rPr>
+          <w:rFonts w:ascii="Consolas" w:hAnsi="Consolas" w:eastAsia="Consolas"/>
+          <w:sz w:val="15"/>
+        </w:rPr>
+        <w:t xml:space="preserve">          file.path(OUT, "hw2_deseq2_results_T4400_vs_DMSO.csv"), row.names = FALSE)</w:t>
+      </w:r>
+    </w:p>
+    <w:p>
+      <w:pPr>
+        <w:spacing w:after="0" w:before="0" w:line="240" w:lineRule="auto"/>
+      </w:pPr>
+      <w:r>
+        <w:rPr>
+          <w:rFonts w:ascii="Consolas" w:hAnsi="Consolas" w:eastAsia="Consolas"/>
+          <w:sz w:val="15"/>
+        </w:rPr>
+      </w:r>
+    </w:p>
+    <w:p>
+      <w:pPr>
+        <w:spacing w:after="0" w:before="0" w:line="240" w:lineRule="auto"/>
+      </w:pPr>
+      <w:r>
+        <w:rPr>
+          <w:rFonts w:ascii="Consolas" w:hAnsi="Consolas" w:eastAsia="Consolas"/>
+          <w:sz w:val="15"/>
+        </w:rPr>
+        <w:t># --- 方向核验：收缩后的符号 vs 原始 counts 组均值 ----------------------------</w:t>
+      </w:r>
+    </w:p>
+    <w:p>
+      <w:pPr>
+        <w:spacing w:after="0" w:before="0" w:line="240" w:lineRule="auto"/>
+      </w:pPr>
+      <w:r>
+        <w:rPr>
+          <w:rFonts w:ascii="Consolas" w:hAnsi="Consolas" w:eastAsia="Consolas"/>
+          <w:sz w:val="15"/>
+        </w:rPr>
+        <w:t>top &lt;- head(rdf[rdf$significant, ], 20)</w:t>
+      </w:r>
+    </w:p>
+    <w:p>
+      <w:pPr>
+        <w:spacing w:after="0" w:before="0" w:line="240" w:lineRule="auto"/>
+      </w:pPr>
+      <w:r>
+        <w:rPr>
+          <w:rFonts w:ascii="Consolas" w:hAnsi="Consolas" w:eastAsia="Consolas"/>
+          <w:sz w:val="15"/>
+        </w:rPr>
+        <w:t>if (nrow(top) &gt; 0) {</w:t>
+      </w:r>
+    </w:p>
+    <w:p>
+      <w:pPr>
+        <w:spacing w:after="0" w:before="0" w:line="240" w:lineRule="auto"/>
+      </w:pPr>
+      <w:r>
+        <w:rPr>
+          <w:rFonts w:ascii="Consolas" w:hAnsi="Consolas" w:eastAsia="Consolas"/>
+          <w:sz w:val="15"/>
+        </w:rPr>
+        <w:t xml:space="preserve">  g_dmso  &lt;- rowMeans(cm_sub[top$feature, meta_sub$Group == "DMSO",  drop = FALSE])</w:t>
+      </w:r>
+    </w:p>
+    <w:p>
+      <w:pPr>
+        <w:spacing w:after="0" w:before="0" w:line="240" w:lineRule="auto"/>
+      </w:pPr>
+      <w:r>
+        <w:rPr>
+          <w:rFonts w:ascii="Consolas" w:hAnsi="Consolas" w:eastAsia="Consolas"/>
+          <w:sz w:val="15"/>
+        </w:rPr>
+        <w:t xml:space="preserve">  g_t4400 &lt;- rowMeans(cm_sub[top$feature, meta_sub$Group == "T4400", drop = FALSE])</w:t>
+      </w:r>
+    </w:p>
+    <w:p>
+      <w:pPr>
+        <w:spacing w:after="0" w:before="0" w:line="240" w:lineRule="auto"/>
+      </w:pPr>
+      <w:r>
+        <w:rPr>
+          <w:rFonts w:ascii="Consolas" w:hAnsi="Consolas" w:eastAsia="Consolas"/>
+          <w:sz w:val="15"/>
+        </w:rPr>
+        <w:t xml:space="preserve">  chk &lt;- data.frame(feature = top$feature,</w:t>
+      </w:r>
+    </w:p>
+    <w:p>
+      <w:pPr>
+        <w:spacing w:after="0" w:before="0" w:line="240" w:lineRule="auto"/>
+      </w:pPr>
+      <w:r>
+        <w:rPr>
+          <w:rFonts w:ascii="Consolas" w:hAnsi="Consolas" w:eastAsia="Consolas"/>
+          <w:sz w:val="15"/>
+        </w:rPr>
+        <w:t xml:space="preserve">                    log2FC_shrunk = top$log2FoldChange,</w:t>
+      </w:r>
+    </w:p>
+    <w:p>
+      <w:pPr>
+        <w:spacing w:after="0" w:before="0" w:line="240" w:lineRule="auto"/>
+      </w:pPr>
+      <w:r>
+        <w:rPr>
+          <w:rFonts w:ascii="Consolas" w:hAnsi="Consolas" w:eastAsia="Consolas"/>
+          <w:sz w:val="15"/>
+        </w:rPr>
+        <w:t xml:space="preserve">                    mean_DMSO = g_dmso, mean_T4400 = g_t4400,</w:t>
+      </w:r>
+    </w:p>
+    <w:p>
+      <w:pPr>
+        <w:spacing w:after="0" w:before="0" w:line="240" w:lineRule="auto"/>
+      </w:pPr>
+      <w:r>
+        <w:rPr>
+          <w:rFonts w:ascii="Consolas" w:hAnsi="Consolas" w:eastAsia="Consolas"/>
+          <w:sz w:val="15"/>
+        </w:rPr>
+        <w:t xml:space="preserve">                    raw_higher_in = ifelse(g_t4400 &gt; g_dmso, "T4400", "DMSO"))</w:t>
+      </w:r>
+    </w:p>
+    <w:p>
+      <w:pPr>
+        <w:spacing w:after="0" w:before="0" w:line="240" w:lineRule="auto"/>
+      </w:pPr>
+      <w:r>
+        <w:rPr>
+          <w:rFonts w:ascii="Consolas" w:hAnsi="Consolas" w:eastAsia="Consolas"/>
+          <w:sz w:val="15"/>
+        </w:rPr>
+        <w:t xml:space="preserve">  chk$agrees &lt;- (chk$log2FC_shrunk &gt; 0) == (chk$raw_higher_in == "T4400")</w:t>
+      </w:r>
+    </w:p>
+    <w:p>
+      <w:pPr>
+        <w:spacing w:after="0" w:before="0" w:line="240" w:lineRule="auto"/>
+      </w:pPr>
+      <w:r>
+        <w:rPr>
+          <w:rFonts w:ascii="Consolas" w:hAnsi="Consolas" w:eastAsia="Consolas"/>
+          <w:sz w:val="15"/>
+        </w:rPr>
+        <w:t xml:space="preserve">  write.csv(chk, file.path(OUT, "hw2_direction_check.csv"), row.names = FALSE)</w:t>
+      </w:r>
+    </w:p>
+    <w:p>
+      <w:pPr>
+        <w:spacing w:after="0" w:before="0" w:line="240" w:lineRule="auto"/>
+      </w:pPr>
+      <w:r>
+        <w:rPr>
+          <w:rFonts w:ascii="Consolas" w:hAnsi="Consolas" w:eastAsia="Consolas"/>
+          <w:sz w:val="15"/>
+        </w:rPr>
+        <w:t xml:space="preserve">  cat(sprintf("方向核验: top%d 中 %d 个与原始组均值一致\n",</w:t>
+      </w:r>
+    </w:p>
+    <w:p>
+      <w:pPr>
+        <w:spacing w:after="0" w:before="0" w:line="240" w:lineRule="auto"/>
+      </w:pPr>
+      <w:r>
+        <w:rPr>
+          <w:rFonts w:ascii="Consolas" w:hAnsi="Consolas" w:eastAsia="Consolas"/>
+          <w:sz w:val="15"/>
+        </w:rPr>
+        <w:t xml:space="preserve">              nrow(chk), sum(chk$agrees)))</w:t>
+      </w:r>
+    </w:p>
+    <w:p>
+      <w:pPr>
+        <w:spacing w:after="0" w:before="0" w:line="240" w:lineRule="auto"/>
+      </w:pPr>
+      <w:r>
+        <w:rPr>
+          <w:rFonts w:ascii="Consolas" w:hAnsi="Consolas" w:eastAsia="Consolas"/>
+          <w:sz w:val="15"/>
+        </w:rPr>
+        <w:t>}</w:t>
+      </w:r>
+    </w:p>
+    <w:p>
+      <w:pPr>
+        <w:spacing w:after="0" w:before="0" w:line="240" w:lineRule="auto"/>
+      </w:pPr>
+      <w:r>
+        <w:rPr>
+          <w:rFonts w:ascii="Consolas" w:hAnsi="Consolas" w:eastAsia="Consolas"/>
+          <w:sz w:val="15"/>
+        </w:rPr>
+      </w:r>
+    </w:p>
+    <w:p>
+      <w:pPr>
+        <w:spacing w:after="0" w:before="0" w:line="240" w:lineRule="auto"/>
+      </w:pPr>
+      <w:r>
+        <w:rPr>
+          <w:rFonts w:ascii="Consolas" w:hAnsi="Consolas" w:eastAsia="Consolas"/>
+          <w:sz w:val="15"/>
+        </w:rPr>
+        <w:t># =============================================================================</w:t>
+      </w:r>
+    </w:p>
+    <w:p>
+      <w:pPr>
+        <w:spacing w:after="0" w:before="0" w:line="240" w:lineRule="auto"/>
+      </w:pPr>
+      <w:r>
+        <w:rPr>
+          <w:rFonts w:ascii="Consolas" w:hAnsi="Consolas" w:eastAsia="Consolas"/>
+          <w:sz w:val="15"/>
+        </w:rPr>
+        <w:t># 6. 火山图</w:t>
+      </w:r>
+    </w:p>
+    <w:p>
+      <w:pPr>
+        <w:spacing w:after="0" w:before="0" w:line="240" w:lineRule="auto"/>
+      </w:pPr>
+      <w:r>
+        <w:rPr>
+          <w:rFonts w:ascii="Consolas" w:hAnsi="Consolas" w:eastAsia="Consolas"/>
+          <w:sz w:val="15"/>
+        </w:rPr>
+        <w:t># =============================================================================</w:t>
+      </w:r>
+    </w:p>
+    <w:p>
+      <w:pPr>
+        <w:spacing w:after="0" w:before="0" w:line="240" w:lineRule="auto"/>
+      </w:pPr>
+      <w:r>
+        <w:rPr>
+          <w:rFonts w:ascii="Consolas" w:hAnsi="Consolas" w:eastAsia="Consolas"/>
+          <w:sz w:val="15"/>
+        </w:rPr>
+        <w:t>vdf &lt;- rdf[!is.na(rdf$padj), ]</w:t>
+      </w:r>
+    </w:p>
+    <w:p>
+      <w:pPr>
+        <w:spacing w:after="0" w:before="0" w:line="240" w:lineRule="auto"/>
+      </w:pPr>
+      <w:r>
+        <w:rPr>
+          <w:rFonts w:ascii="Consolas" w:hAnsi="Consolas" w:eastAsia="Consolas"/>
+          <w:sz w:val="15"/>
+        </w:rPr>
+        <w:t>lab &lt;- head(vdf[vdf$significant, ], 15)</w:t>
+      </w:r>
+    </w:p>
+    <w:p>
+      <w:pPr>
+        <w:spacing w:after="0" w:before="0" w:line="240" w:lineRule="auto"/>
+      </w:pPr>
+      <w:r>
+        <w:rPr>
+          <w:rFonts w:ascii="Consolas" w:hAnsi="Consolas" w:eastAsia="Consolas"/>
+          <w:sz w:val="15"/>
+        </w:rPr>
+      </w:r>
+    </w:p>
+    <w:p>
+      <w:pPr>
+        <w:spacing w:after="0" w:before="0" w:line="240" w:lineRule="auto"/>
+      </w:pPr>
+      <w:r>
+        <w:rPr>
+          <w:rFonts w:ascii="Consolas" w:hAnsi="Consolas" w:eastAsia="Consolas"/>
+          <w:sz w:val="15"/>
+        </w:rPr>
+        <w:t>p_vol &lt;- ggplot(vdf, aes(log2FoldChange, -log10(padj), colour = direction)) +</w:t>
+      </w:r>
+    </w:p>
+    <w:p>
+      <w:pPr>
+        <w:spacing w:after="0" w:before="0" w:line="240" w:lineRule="auto"/>
+      </w:pPr>
+      <w:r>
+        <w:rPr>
+          <w:rFonts w:ascii="Consolas" w:hAnsi="Consolas" w:eastAsia="Consolas"/>
+          <w:sz w:val="15"/>
+        </w:rPr>
+        <w:t xml:space="preserve">  geom_point(alpha = .55, size = 1.5) +</w:t>
+      </w:r>
+    </w:p>
+    <w:p>
+      <w:pPr>
+        <w:spacing w:after="0" w:before="0" w:line="240" w:lineRule="auto"/>
+      </w:pPr>
+      <w:r>
+        <w:rPr>
+          <w:rFonts w:ascii="Consolas" w:hAnsi="Consolas" w:eastAsia="Consolas"/>
+          <w:sz w:val="15"/>
+        </w:rPr>
+        <w:t xml:space="preserve">  geom_hline(yintercept = -log10(PADJ), linetype = "22", colour = "#6B6478") +</w:t>
+      </w:r>
+    </w:p>
+    <w:p>
+      <w:pPr>
+        <w:spacing w:after="0" w:before="0" w:line="240" w:lineRule="auto"/>
+      </w:pPr>
+      <w:r>
+        <w:rPr>
+          <w:rFonts w:ascii="Consolas" w:hAnsi="Consolas" w:eastAsia="Consolas"/>
+          <w:sz w:val="15"/>
+        </w:rPr>
+        <w:t xml:space="preserve">  geom_vline(xintercept = c(-LFC, LFC), linetype = "22", colour = "#6B6478") +</w:t>
+      </w:r>
+    </w:p>
+    <w:p>
+      <w:pPr>
+        <w:spacing w:after="0" w:before="0" w:line="240" w:lineRule="auto"/>
+      </w:pPr>
+      <w:r>
+        <w:rPr>
+          <w:rFonts w:ascii="Consolas" w:hAnsi="Consolas" w:eastAsia="Consolas"/>
+          <w:sz w:val="15"/>
+        </w:rPr>
+        <w:t xml:space="preserve">  ggrepel::geom_text_repel(data = lab, aes(label = feature), size = 2.9,</w:t>
+      </w:r>
+    </w:p>
+    <w:p>
+      <w:pPr>
+        <w:spacing w:after="0" w:before="0" w:line="240" w:lineRule="auto"/>
+      </w:pPr>
+      <w:r>
+        <w:rPr>
+          <w:rFonts w:ascii="Consolas" w:hAnsi="Consolas" w:eastAsia="Consolas"/>
+          <w:sz w:val="15"/>
+        </w:rPr>
+        <w:t xml:space="preserve">                           max.overlaps = 20, seed = 1, show.legend = FALSE) +</w:t>
+      </w:r>
+    </w:p>
+    <w:p>
+      <w:pPr>
+        <w:spacing w:after="0" w:before="0" w:line="240" w:lineRule="auto"/>
+      </w:pPr>
+      <w:r>
+        <w:rPr>
+          <w:rFonts w:ascii="Consolas" w:hAnsi="Consolas" w:eastAsia="Consolas"/>
+          <w:sz w:val="15"/>
+        </w:rPr>
+        <w:t xml:space="preserve">  scale_colour_manual(values = c("ns" = "#C9C5D1",</w:t>
+      </w:r>
+    </w:p>
+    <w:p>
+      <w:pPr>
+        <w:spacing w:after="0" w:before="0" w:line="240" w:lineRule="auto"/>
+      </w:pPr>
+      <w:r>
+        <w:rPr>
+          <w:rFonts w:ascii="Consolas" w:hAnsi="Consolas" w:eastAsia="Consolas"/>
+          <w:sz w:val="15"/>
+        </w:rPr>
+        <w:t xml:space="preserve">                                 "up in T4400" = "#B4341F",</w:t>
+      </w:r>
+    </w:p>
+    <w:p>
+      <w:pPr>
+        <w:spacing w:after="0" w:before="0" w:line="240" w:lineRule="auto"/>
+      </w:pPr>
+      <w:r>
+        <w:rPr>
+          <w:rFonts w:ascii="Consolas" w:hAnsi="Consolas" w:eastAsia="Consolas"/>
+          <w:sz w:val="15"/>
+        </w:rPr>
+        <w:t xml:space="preserve">                                 "down in T4400" = "#2F6F4E"), name = NULL) +</w:t>
+      </w:r>
+    </w:p>
+    <w:p>
+      <w:pPr>
+        <w:spacing w:after="0" w:before="0" w:line="240" w:lineRule="auto"/>
+      </w:pPr>
+      <w:r>
+        <w:rPr>
+          <w:rFonts w:ascii="Consolas" w:hAnsi="Consolas" w:eastAsia="Consolas"/>
+          <w:sz w:val="15"/>
+        </w:rPr>
+        <w:t xml:space="preserve">  labs(title = "T4400 versus DMSO — apeglm-shrunken log2 fold change",</w:t>
+      </w:r>
+    </w:p>
+    <w:p>
+      <w:pPr>
+        <w:spacing w:after="0" w:before="0" w:line="240" w:lineRule="auto"/>
+      </w:pPr>
+      <w:r>
+        <w:rPr>
+          <w:rFonts w:ascii="Consolas" w:hAnsi="Consolas" w:eastAsia="Consolas"/>
+          <w:sz w:val="15"/>
+        </w:rPr>
+        <w:t xml:space="preserve">       subtitle = sprintf("padj &lt; %.2f and |log2FC| &gt;= %g | up %d, down %d | rebuilt in R",</w:t>
+      </w:r>
+    </w:p>
+    <w:p>
+      <w:pPr>
+        <w:spacing w:after="0" w:before="0" w:line="240" w:lineRule="auto"/>
+      </w:pPr>
+      <w:r>
+        <w:rPr>
+          <w:rFonts w:ascii="Consolas" w:hAnsi="Consolas" w:eastAsia="Consolas"/>
+          <w:sz w:val="15"/>
+        </w:rPr>
+        <w:t xml:space="preserve">                          PADJ, LFC, n_up, n_down),</w:t>
+      </w:r>
+    </w:p>
+    <w:p>
+      <w:pPr>
+        <w:spacing w:after="0" w:before="0" w:line="240" w:lineRule="auto"/>
+      </w:pPr>
+      <w:r>
+        <w:rPr>
+          <w:rFonts w:ascii="Consolas" w:hAnsi="Consolas" w:eastAsia="Consolas"/>
+          <w:sz w:val="15"/>
+        </w:rPr>
+        <w:t xml:space="preserve">       x = "log2 fold change (T4400 / DMSO)", y = "-log10 adjusted p") +</w:t>
+      </w:r>
+    </w:p>
+    <w:p>
+      <w:pPr>
+        <w:spacing w:after="0" w:before="0" w:line="240" w:lineRule="auto"/>
+      </w:pPr>
+      <w:r>
+        <w:rPr>
+          <w:rFonts w:ascii="Consolas" w:hAnsi="Consolas" w:eastAsia="Consolas"/>
+          <w:sz w:val="15"/>
+        </w:rPr>
+        <w:t xml:space="preserve">  theme_minimal(base_size = 11) +</w:t>
+      </w:r>
+    </w:p>
+    <w:p>
+      <w:pPr>
+        <w:spacing w:after="0" w:before="0" w:line="240" w:lineRule="auto"/>
+      </w:pPr>
+      <w:r>
+        <w:rPr>
+          <w:rFonts w:ascii="Consolas" w:hAnsi="Consolas" w:eastAsia="Consolas"/>
+          <w:sz w:val="15"/>
+        </w:rPr>
+        <w:t xml:space="preserve">  theme(plot.title = element_text(face = "bold"), legend.position = "bottom")</w:t>
+      </w:r>
+    </w:p>
+    <w:p>
+      <w:pPr>
+        <w:spacing w:after="0" w:before="0" w:line="240" w:lineRule="auto"/>
+      </w:pPr>
+      <w:r>
+        <w:rPr>
+          <w:rFonts w:ascii="Consolas" w:hAnsi="Consolas" w:eastAsia="Consolas"/>
+          <w:sz w:val="15"/>
+        </w:rPr>
+        <w:t>ggsave(file.path(OUT, "hw2_volcano_T4400_vs_DMSO.png"), p_vol,</w:t>
+      </w:r>
+    </w:p>
+    <w:p>
+      <w:pPr>
+        <w:spacing w:after="0" w:before="0" w:line="240" w:lineRule="auto"/>
+      </w:pPr>
+      <w:r>
+        <w:rPr>
+          <w:rFonts w:ascii="Consolas" w:hAnsi="Consolas" w:eastAsia="Consolas"/>
+          <w:sz w:val="15"/>
+        </w:rPr>
+        <w:t xml:space="preserve">       width = 8.2, height = 6.2, dpi = 200, bg = "white")</w:t>
+      </w:r>
+    </w:p>
+    <w:p>
+      <w:pPr>
+        <w:spacing w:after="0" w:before="0" w:line="240" w:lineRule="auto"/>
+      </w:pPr>
+      <w:r>
+        <w:rPr>
+          <w:rFonts w:ascii="Consolas" w:hAnsi="Consolas" w:eastAsia="Consolas"/>
+          <w:sz w:val="15"/>
+        </w:rPr>
+      </w:r>
+    </w:p>
+    <w:p>
+      <w:pPr>
+        <w:spacing w:after="0" w:before="0" w:line="240" w:lineRule="auto"/>
+      </w:pPr>
+      <w:r>
+        <w:rPr>
+          <w:rFonts w:ascii="Consolas" w:hAnsi="Consolas" w:eastAsia="Consolas"/>
+          <w:sz w:val="15"/>
+        </w:rPr>
+        <w:t># =============================================================================</w:t>
+      </w:r>
+    </w:p>
+    <w:p>
+      <w:pPr>
+        <w:spacing w:after="0" w:before="0" w:line="240" w:lineRule="auto"/>
+      </w:pPr>
+      <w:r>
+        <w:rPr>
+          <w:rFonts w:ascii="Consolas" w:hAnsi="Consolas" w:eastAsia="Consolas"/>
+          <w:sz w:val="15"/>
+        </w:rPr>
+        <w:t># 7. 存档</w:t>
+      </w:r>
+    </w:p>
+    <w:p>
+      <w:pPr>
+        <w:spacing w:after="0" w:before="0" w:line="240" w:lineRule="auto"/>
+      </w:pPr>
+      <w:r>
+        <w:rPr>
+          <w:rFonts w:ascii="Consolas" w:hAnsi="Consolas" w:eastAsia="Consolas"/>
+          <w:sz w:val="15"/>
+        </w:rPr>
+        <w:t># =============================================================================</w:t>
+      </w:r>
+    </w:p>
+    <w:p>
+      <w:pPr>
+        <w:spacing w:after="0" w:before="0" w:line="240" w:lineRule="auto"/>
+      </w:pPr>
+      <w:r>
+        <w:rPr>
+          <w:rFonts w:ascii="Consolas" w:hAnsi="Consolas" w:eastAsia="Consolas"/>
+          <w:sz w:val="15"/>
+        </w:rPr>
+        <w:t>saveRDS(dds, file.path(OUT, "hw2_dds_T4400_vs_DMSO.rds"))</w:t>
+      </w:r>
+    </w:p>
+    <w:p>
+      <w:pPr>
+        <w:spacing w:after="0" w:before="0" w:line="240" w:lineRule="auto"/>
+      </w:pPr>
+      <w:r>
+        <w:rPr>
+          <w:rFonts w:ascii="Consolas" w:hAnsi="Consolas" w:eastAsia="Consolas"/>
+          <w:sz w:val="15"/>
+        </w:rPr>
+        <w:t>writeLines(capture.output(sessionInfo()), file.path(OUT, "hw2_session_info.txt"))</w:t>
+      </w:r>
+    </w:p>
+    <w:p>
+      <w:pPr>
+        <w:spacing w:after="0" w:before="0" w:line="240" w:lineRule="auto"/>
+      </w:pPr>
+      <w:r>
+        <w:rPr>
+          <w:rFonts w:ascii="Consolas" w:hAnsi="Consolas" w:eastAsia="Consolas"/>
+          <w:sz w:val="15"/>
+        </w:rPr>
+      </w:r>
+    </w:p>
+    <w:p>
+      <w:pPr>
+        <w:spacing w:after="0" w:before="0" w:line="240" w:lineRule="auto"/>
+      </w:pPr>
+      <w:r>
+        <w:rPr>
+          <w:rFonts w:ascii="Consolas" w:hAnsi="Consolas" w:eastAsia="Consolas"/>
+          <w:sz w:val="15"/>
+        </w:rPr>
+        <w:t>summary_tbl &lt;- data.frame(</w:t>
+      </w:r>
+    </w:p>
+    <w:p>
+      <w:pPr>
+        <w:spacing w:after="0" w:before="0" w:line="240" w:lineRule="auto"/>
+      </w:pPr>
+      <w:r>
+        <w:rPr>
+          <w:rFonts w:ascii="Consolas" w:hAnsi="Consolas" w:eastAsia="Consolas"/>
+          <w:sz w:val="15"/>
+        </w:rPr>
+        <w:t xml:space="preserve">  item = c("source_counts", "source_mapping", "feature_set", "n_features",</w:t>
+      </w:r>
+    </w:p>
+    <w:p>
+      <w:pPr>
+        <w:spacing w:after="0" w:before="0" w:line="240" w:lineRule="auto"/>
+      </w:pPr>
+      <w:r>
+        <w:rPr>
+          <w:rFonts w:ascii="Consolas" w:hAnsi="Consolas" w:eastAsia="Consolas"/>
+          <w:sz w:val="15"/>
+        </w:rPr>
+        <w:t xml:space="preserve">           "contrast", "reference_level", "shrinkage", "padj_threshold",</w:t>
+      </w:r>
+    </w:p>
+    <w:p>
+      <w:pPr>
+        <w:spacing w:after="0" w:before="0" w:line="240" w:lineRule="auto"/>
+      </w:pPr>
+      <w:r>
+        <w:rPr>
+          <w:rFonts w:ascii="Consolas" w:hAnsi="Consolas" w:eastAsia="Consolas"/>
+          <w:sz w:val="15"/>
+        </w:rPr>
+        <w:t xml:space="preserve">           "lfc_threshold", "n_up", "n_down", "n_significant", "n_padj_NA",</w:t>
+      </w:r>
+    </w:p>
+    <w:p>
+      <w:pPr>
+        <w:spacing w:after="0" w:before="0" w:line="240" w:lineRule="auto"/>
+      </w:pPr>
+      <w:r>
+        <w:rPr>
+          <w:rFonts w:ascii="Consolas" w:hAnsi="Consolas" w:eastAsia="Consolas"/>
+          <w:sz w:val="15"/>
+        </w:rPr>
+        <w:t xml:space="preserve">           "n_padj_only", "PC1_pct", "PC2_pct"),</w:t>
+      </w:r>
+    </w:p>
+    <w:p>
+      <w:pPr>
+        <w:spacing w:after="0" w:before="0" w:line="240" w:lineRule="auto"/>
+      </w:pPr>
+      <w:r>
+        <w:rPr>
+          <w:rFonts w:ascii="Consolas" w:hAnsi="Consolas" w:eastAsia="Consolas"/>
+          <w:sz w:val="15"/>
+        </w:rPr>
+        <w:t xml:space="preserve">  value = c("EasyMultiProfiler-Web/tests/RNAseq_output.csv",</w:t>
+      </w:r>
+    </w:p>
+    <w:p>
+      <w:pPr>
+        <w:spacing w:after="0" w:before="0" w:line="240" w:lineRule="auto"/>
+      </w:pPr>
+      <w:r>
+        <w:rPr>
+          <w:rFonts w:ascii="Consolas" w:hAnsi="Consolas" w:eastAsia="Consolas"/>
+          <w:sz w:val="15"/>
+        </w:rPr>
+        <w:t xml:space="preserve">            "EasyMultiProfiler-Web/tests/RNAseq_mapping.csv",</w:t>
+      </w:r>
+    </w:p>
+    <w:p>
+      <w:pPr>
+        <w:spacing w:after="0" w:before="0" w:line="240" w:lineRule="auto"/>
+      </w:pPr>
+      <w:r>
+        <w:rPr>
+          <w:rFonts w:ascii="Consolas" w:hAnsi="Consolas" w:eastAsia="Consolas"/>
+          <w:sz w:val="15"/>
+        </w:rPr>
+        <w:t xml:space="preserve">            "EMP-retained genes read from RNAseq_output_assay.csv",</w:t>
+      </w:r>
+    </w:p>
+    <w:p>
+      <w:pPr>
+        <w:spacing w:after="0" w:before="0" w:line="240" w:lineRule="auto"/>
+      </w:pPr>
+      <w:r>
+        <w:rPr>
+          <w:rFonts w:ascii="Consolas" w:hAnsi="Consolas" w:eastAsia="Consolas"/>
+          <w:sz w:val="15"/>
+        </w:rPr>
+        <w:t xml:space="preserve">            nrow(cm), "T4400 vs DMSO", "DMSO", "apeglm", PADJ, LFC,</w:t>
+      </w:r>
+    </w:p>
+    <w:p>
+      <w:pPr>
+        <w:spacing w:after="0" w:before="0" w:line="240" w:lineRule="auto"/>
+      </w:pPr>
+      <w:r>
+        <w:rPr>
+          <w:rFonts w:ascii="Consolas" w:hAnsi="Consolas" w:eastAsia="Consolas"/>
+          <w:sz w:val="15"/>
+        </w:rPr>
+        <w:t xml:space="preserve">            n_up, n_down, n_up + n_down, n_na, n_padj_only, pv[1], pv[2])</w:t>
+      </w:r>
+    </w:p>
+    <w:p>
+      <w:pPr>
+        <w:spacing w:after="0" w:before="0" w:line="240" w:lineRule="auto"/>
+      </w:pPr>
+      <w:r>
+        <w:rPr>
+          <w:rFonts w:ascii="Consolas" w:hAnsi="Consolas" w:eastAsia="Consolas"/>
+          <w:sz w:val="15"/>
+        </w:rPr>
+        <w:t>)</w:t>
+      </w:r>
+    </w:p>
+    <w:p>
+      <w:pPr>
+        <w:spacing w:after="0" w:before="0" w:line="240" w:lineRule="auto"/>
+      </w:pPr>
+      <w:r>
+        <w:rPr>
+          <w:rFonts w:ascii="Consolas" w:hAnsi="Consolas" w:eastAsia="Consolas"/>
+          <w:sz w:val="15"/>
+        </w:rPr>
+        <w:t>write.csv(summary_tbl, file.path(OUT, "hw2_rebuild_summary.csv"), row.names = FALSE)</w:t>
+      </w:r>
+    </w:p>
+    <w:p>
+      <w:pPr>
+        <w:spacing w:after="0" w:before="0" w:line="240" w:lineRule="auto"/>
+      </w:pPr>
+      <w:r>
+        <w:rPr>
+          <w:rFonts w:ascii="Consolas" w:hAnsi="Consolas" w:eastAsia="Consolas"/>
+          <w:sz w:val="15"/>
+        </w:rPr>
+      </w:r>
+    </w:p>
+    <w:p>
+      <w:pPr>
+        <w:spacing w:after="0" w:before="0" w:line="240" w:lineRule="auto"/>
+      </w:pPr>
+      <w:r>
+        <w:rPr>
+          <w:rFonts w:ascii="Consolas" w:hAnsi="Consolas" w:eastAsia="Consolas"/>
+          <w:sz w:val="15"/>
+        </w:rPr>
+        <w:t>cat("\n完成。产物写入 ", OUT, "\n", sep = "")</w:t>
+      </w:r>
+    </w:p>
+    <w:p>
+      <w:r>
+        <w:br w:type="page"/>
+      </w:r>
+    </w:p>
+    <w:p>
+      <w:pPr>
+        <w:spacing w:before="320" w:after="120"/>
+      </w:pPr>
+      <w:r>
+        <w:rPr>
+          <w:b/>
+          <w:color w:val="2F2F6F"/>
+          <w:sz w:val="30"/>
+          <w:rFonts w:eastAsia="Microsoft YaHei"/>
+        </w:rPr>
+        <w:t>附录 B — 真实运行输出（控制台日志）</w:t>
+      </w:r>
+    </w:p>
+    <w:p>
+      <w:pPr>
+        <w:spacing w:after="120"/>
+      </w:pPr>
+      <w:r>
+        <w:rPr>
+          <w:i w:val="0"/>
+          <w:color w:val="1A1A1A"/>
+          <w:sz w:val="21"/>
+          <w:rFonts w:eastAsia="Microsoft YaHei"/>
+        </w:rPr>
+        <w:t>以下为上述脚本在本机实际运行的原样输出，未经编辑。</w:t>
+      </w:r>
+    </w:p>
+    <w:p>
+      <w:pPr>
+        <w:spacing w:after="0" w:before="0" w:line="240" w:lineRule="auto"/>
+      </w:pPr>
+      <w:r>
+        <w:rPr>
+          <w:rFonts w:ascii="Consolas" w:hAnsi="Consolas" w:eastAsia="Consolas"/>
+          <w:sz w:val="16"/>
+        </w:rPr>
+        <w:t>﻿========== Week 5 Homework 2 · R 重建运行日志 ==========</w:t>
+      </w:r>
+    </w:p>
+    <w:p>
+      <w:pPr>
+        <w:spacing w:after="0" w:before="0" w:line="240" w:lineRule="auto"/>
+      </w:pPr>
+      <w:r>
+        <w:rPr>
+          <w:rFonts w:ascii="Consolas" w:hAnsi="Consolas" w:eastAsia="Consolas"/>
+          <w:sz w:val="16"/>
+        </w:rPr>
+        <w:t>运行时间 : 2026-09-24 10:11:36</w:t>
+      </w:r>
+    </w:p>
+    <w:p>
+      <w:pPr>
+        <w:spacing w:after="0" w:before="0" w:line="240" w:lineRule="auto"/>
+      </w:pPr>
+      <w:r>
+        <w:rPr>
+          <w:rFonts w:ascii="Consolas" w:hAnsi="Consolas" w:eastAsia="Consolas"/>
+          <w:sz w:val="16"/>
+        </w:rPr>
+        <w:t>R 版本   : R version 4.6.1 (2026-06-24 ucrt)</w:t>
+      </w:r>
+    </w:p>
+    <w:p>
+      <w:pPr>
+        <w:spacing w:after="0" w:before="0" w:line="240" w:lineRule="auto"/>
+      </w:pPr>
+      <w:r>
+        <w:rPr>
+          <w:rFonts w:ascii="Consolas" w:hAnsi="Consolas" w:eastAsia="Consolas"/>
+          <w:sz w:val="16"/>
+        </w:rPr>
+        <w:t>平台     : Windows 11 x64</w:t>
+      </w:r>
+    </w:p>
+    <w:p>
+      <w:pPr>
+        <w:spacing w:after="0" w:before="0" w:line="240" w:lineRule="auto"/>
+      </w:pPr>
+      <w:r>
+        <w:rPr>
+          <w:rFonts w:ascii="Consolas" w:hAnsi="Consolas" w:eastAsia="Consolas"/>
+          <w:sz w:val="16"/>
+        </w:rPr>
+        <w:t>工作目录 : D:/BioLession in total/Bioinformatics/week5/hw2_rebuild</w:t>
+      </w:r>
+    </w:p>
+    <w:p>
+      <w:pPr>
+        <w:spacing w:after="0" w:before="0" w:line="240" w:lineRule="auto"/>
+      </w:pPr>
+      <w:r>
+        <w:rPr>
+          <w:rFonts w:ascii="Consolas" w:hAnsi="Consolas" w:eastAsia="Consolas"/>
+          <w:sz w:val="16"/>
+        </w:rPr>
+        <w:t>脚本     : hw2_rebuild_analysis.R</w:t>
+      </w:r>
+    </w:p>
+    <w:p>
+      <w:pPr>
+        <w:spacing w:after="0" w:before="0" w:line="240" w:lineRule="auto"/>
+      </w:pPr>
+      <w:r>
+        <w:rPr>
+          <w:rFonts w:ascii="Consolas" w:hAnsi="Consolas" w:eastAsia="Consolas"/>
+          <w:sz w:val="16"/>
+        </w:rPr>
+        <w:t>调用     : Rscript hw2_rebuild_analysis.R</w:t>
+      </w:r>
+    </w:p>
+    <w:p>
+      <w:pPr>
+        <w:spacing w:after="0" w:before="0" w:line="240" w:lineRule="auto"/>
+      </w:pPr>
+      <w:r>
+        <w:rPr>
+          <w:rFonts w:ascii="Consolas" w:hAnsi="Consolas" w:eastAsia="Consolas"/>
+          <w:sz w:val="16"/>
+        </w:rPr>
+      </w:r>
+    </w:p>
+    <w:p>
+      <w:pPr>
+        <w:spacing w:after="0" w:before="0" w:line="240" w:lineRule="auto"/>
+      </w:pPr>
+      <w:r>
+        <w:rPr>
+          <w:rFonts w:ascii="Consolas" w:hAnsi="Consolas" w:eastAsia="Consolas"/>
+          <w:sz w:val="16"/>
+        </w:rPr>
+        <w:t>---------- 控制台输出（原样） ----------</w:t>
+      </w:r>
+    </w:p>
+    <w:p>
+      <w:pPr>
+        <w:spacing w:after="0" w:before="0" w:line="240" w:lineRule="auto"/>
+      </w:pPr>
+      <w:r>
+        <w:rPr>
+          <w:rFonts w:ascii="Consolas" w:hAnsi="Consolas" w:eastAsia="Consolas"/>
+          <w:sz w:val="16"/>
+        </w:rPr>
+        <w:t>输入: 24394 基因 x 24 样本, 全为非负整数, 样本顺序一致</w:t>
+      </w:r>
+    </w:p>
+    <w:p>
+      <w:pPr>
+        <w:spacing w:after="0" w:before="0" w:line="240" w:lineRule="auto"/>
+      </w:pPr>
+      <w:r>
+        <w:rPr>
+          <w:rFonts w:ascii="Consolas" w:hAnsi="Consolas" w:eastAsia="Consolas"/>
+          <w:sz w:val="16"/>
+        </w:rPr>
+        <w:t>特征集: 采用 EMP 保留的 14245 个基因（从平台导出的 assay 读取，非本脚本重新过滤）</w:t>
+      </w:r>
+    </w:p>
+    <w:p>
+      <w:pPr>
+        <w:spacing w:after="0" w:before="0" w:line="240" w:lineRule="auto"/>
+      </w:pPr>
+      <w:r>
+        <w:rPr>
+          <w:rFonts w:ascii="Consolas" w:hAnsi="Consolas" w:eastAsia="Consolas"/>
+          <w:sz w:val="16"/>
+        </w:rPr>
+      </w:r>
+    </w:p>
+    <w:p>
+      <w:pPr>
+        <w:spacing w:after="0" w:before="0" w:line="240" w:lineRule="auto"/>
+      </w:pPr>
+      <w:r>
+        <w:rPr>
+          <w:rFonts w:ascii="Consolas" w:hAnsi="Consolas" w:eastAsia="Consolas"/>
+          <w:sz w:val="16"/>
+        </w:rPr>
+        <w:t>分组结构:</w:t>
+      </w:r>
+    </w:p>
+    <w:p>
+      <w:pPr>
+        <w:spacing w:after="0" w:before="0" w:line="240" w:lineRule="auto"/>
+      </w:pPr>
+      <w:r>
+        <w:rPr>
+          <w:rFonts w:ascii="Consolas" w:hAnsi="Consolas" w:eastAsia="Consolas"/>
+          <w:sz w:val="16"/>
+        </w:rPr>
+      </w:r>
+    </w:p>
+    <w:p>
+      <w:pPr>
+        <w:spacing w:after="0" w:before="0" w:line="240" w:lineRule="auto"/>
+      </w:pPr>
+      <w:r>
+        <w:rPr>
+          <w:rFonts w:ascii="Consolas" w:hAnsi="Consolas" w:eastAsia="Consolas"/>
+          <w:sz w:val="16"/>
+        </w:rPr>
+        <w:t xml:space="preserve">       DMSO  DMSO+LIPUS       T3976 T3976+LIPUS       T4400 T4400+LIPUS </w:t>
+      </w:r>
+    </w:p>
+    <w:p>
+      <w:pPr>
+        <w:spacing w:after="0" w:before="0" w:line="240" w:lineRule="auto"/>
+      </w:pPr>
+      <w:r>
+        <w:rPr>
+          <w:rFonts w:ascii="Consolas" w:hAnsi="Consolas" w:eastAsia="Consolas"/>
+          <w:sz w:val="16"/>
+        </w:rPr>
+        <w:t xml:space="preserve">          4           4           4           4           4           4 </w:t>
+      </w:r>
+    </w:p>
+    <w:p>
+      <w:pPr>
+        <w:spacing w:after="0" w:before="0" w:line="240" w:lineRule="auto"/>
+      </w:pPr>
+      <w:r>
+        <w:rPr>
+          <w:rFonts w:ascii="Consolas" w:hAnsi="Consolas" w:eastAsia="Consolas"/>
+          <w:sz w:val="16"/>
+        </w:rPr>
+        <w:t xml:space="preserve">  Note: levels of factors in the design contain characters other than</w:t>
+      </w:r>
+    </w:p>
+    <w:p>
+      <w:pPr>
+        <w:spacing w:after="0" w:before="0" w:line="240" w:lineRule="auto"/>
+      </w:pPr>
+      <w:r>
+        <w:rPr>
+          <w:rFonts w:ascii="Consolas" w:hAnsi="Consolas" w:eastAsia="Consolas"/>
+          <w:sz w:val="16"/>
+        </w:rPr>
+        <w:t xml:space="preserve">  letters, numbers, '_' and '.'. It is recommended (but not required) to use</w:t>
+      </w:r>
+    </w:p>
+    <w:p>
+      <w:pPr>
+        <w:spacing w:after="0" w:before="0" w:line="240" w:lineRule="auto"/>
+      </w:pPr>
+      <w:r>
+        <w:rPr>
+          <w:rFonts w:ascii="Consolas" w:hAnsi="Consolas" w:eastAsia="Consolas"/>
+          <w:sz w:val="16"/>
+        </w:rPr>
+        <w:t xml:space="preserve">  only letters, numbers, and delimiters '_' or '.', as these are safe characters</w:t>
+      </w:r>
+    </w:p>
+    <w:p>
+      <w:pPr>
+        <w:spacing w:after="0" w:before="0" w:line="240" w:lineRule="auto"/>
+      </w:pPr>
+      <w:r>
+        <w:rPr>
+          <w:rFonts w:ascii="Consolas" w:hAnsi="Consolas" w:eastAsia="Consolas"/>
+          <w:sz w:val="16"/>
+        </w:rPr>
+        <w:t xml:space="preserve">  for column names in R. [This is a message, not a warning or an error]</w:t>
+      </w:r>
+    </w:p>
+    <w:p>
+      <w:pPr>
+        <w:spacing w:after="0" w:before="0" w:line="240" w:lineRule="auto"/>
+      </w:pPr>
+      <w:r>
+        <w:rPr>
+          <w:rFonts w:ascii="Consolas" w:hAnsi="Consolas" w:eastAsia="Consolas"/>
+          <w:sz w:val="16"/>
+        </w:rPr>
+      </w:r>
+    </w:p>
+    <w:p>
+      <w:pPr>
+        <w:spacing w:after="0" w:before="0" w:line="240" w:lineRule="auto"/>
+      </w:pPr>
+      <w:r>
+        <w:rPr>
+          <w:rFonts w:ascii="Consolas" w:hAnsi="Consolas" w:eastAsia="Consolas"/>
+          <w:sz w:val="16"/>
+        </w:rPr>
+        <w:t>PCA: PC1 56.4%, PC2 13.9%</w:t>
+      </w:r>
+    </w:p>
+    <w:p>
+      <w:pPr>
+        <w:spacing w:after="0" w:before="0" w:line="240" w:lineRule="auto"/>
+      </w:pPr>
+      <w:r>
+        <w:rPr>
+          <w:rFonts w:ascii="Consolas" w:hAnsi="Consolas" w:eastAsia="Consolas"/>
+          <w:sz w:val="16"/>
+        </w:rPr>
+      </w:r>
+    </w:p>
+    <w:p>
+      <w:pPr>
+        <w:spacing w:after="0" w:before="0" w:line="240" w:lineRule="auto"/>
+      </w:pPr>
+      <w:r>
+        <w:rPr>
+          <w:rFonts w:ascii="Consolas" w:hAnsi="Consolas" w:eastAsia="Consolas"/>
+          <w:sz w:val="16"/>
+        </w:rPr>
+        <w:t>差异分析子集: 8 样本 (DMSO=4, T4400=4)</w:t>
+      </w:r>
+    </w:p>
+    <w:p>
+      <w:pPr>
+        <w:spacing w:after="0" w:before="0" w:line="240" w:lineRule="auto"/>
+      </w:pPr>
+      <w:r>
+        <w:rPr>
+          <w:rFonts w:ascii="Consolas" w:hAnsi="Consolas" w:eastAsia="Consolas"/>
+          <w:sz w:val="16"/>
+        </w:rPr>
+        <w:t>模型矩阵满秩: 2/2</w:t>
+      </w:r>
+    </w:p>
+    <w:p>
+      <w:pPr>
+        <w:spacing w:after="0" w:before="0" w:line="240" w:lineRule="auto"/>
+      </w:pPr>
+      <w:r>
+        <w:rPr>
+          <w:rFonts w:ascii="Consolas" w:hAnsi="Consolas" w:eastAsia="Consolas"/>
+          <w:sz w:val="16"/>
+        </w:rPr>
+        <w:t xml:space="preserve">resultsNames:  Intercept | Group_T4400_vs_DMSO </w:t>
+      </w:r>
+    </w:p>
+    <w:p>
+      <w:pPr>
+        <w:spacing w:after="0" w:before="0" w:line="240" w:lineRule="auto"/>
+      </w:pPr>
+      <w:r>
+        <w:rPr>
+          <w:rFonts w:ascii="Consolas" w:hAnsi="Consolas" w:eastAsia="Consolas"/>
+          <w:sz w:val="16"/>
+        </w:rPr>
+      </w:r>
+    </w:p>
+    <w:p>
+      <w:pPr>
+        <w:spacing w:after="0" w:before="0" w:line="240" w:lineRule="auto"/>
+      </w:pPr>
+      <w:r>
+        <w:rPr>
+          <w:rFonts w:ascii="Consolas" w:hAnsi="Consolas" w:eastAsia="Consolas"/>
+          <w:sz w:val="16"/>
+        </w:rPr>
+        <w:t>阈值 padj &lt; 0.05 且 |log2FC| &gt;= 1</w:t>
+      </w:r>
+    </w:p>
+    <w:p>
+      <w:pPr>
+        <w:spacing w:after="0" w:before="0" w:line="240" w:lineRule="auto"/>
+      </w:pPr>
+      <w:r>
+        <w:rPr>
+          <w:rFonts w:ascii="Consolas" w:hAnsi="Consolas" w:eastAsia="Consolas"/>
+          <w:sz w:val="16"/>
+        </w:rPr>
+        <w:t xml:space="preserve">  上调 (T4400 更高): 116</w:t>
+      </w:r>
+    </w:p>
+    <w:p>
+      <w:pPr>
+        <w:spacing w:after="0" w:before="0" w:line="240" w:lineRule="auto"/>
+      </w:pPr>
+      <w:r>
+        <w:rPr>
+          <w:rFonts w:ascii="Consolas" w:hAnsi="Consolas" w:eastAsia="Consolas"/>
+          <w:sz w:val="16"/>
+        </w:rPr>
+        <w:t xml:space="preserve">  下调 (T4400 更低): 12</w:t>
+      </w:r>
+    </w:p>
+    <w:p>
+      <w:pPr>
+        <w:spacing w:after="0" w:before="0" w:line="240" w:lineRule="auto"/>
+      </w:pPr>
+      <w:r>
+        <w:rPr>
+          <w:rFonts w:ascii="Consolas" w:hAnsi="Consolas" w:eastAsia="Consolas"/>
+          <w:sz w:val="16"/>
+        </w:rPr>
+        <w:t xml:space="preserve">  合计显著          : 128</w:t>
+      </w:r>
+    </w:p>
+    <w:p>
+      <w:pPr>
+        <w:spacing w:after="0" w:before="0" w:line="240" w:lineRule="auto"/>
+      </w:pPr>
+      <w:r>
+        <w:rPr>
+          <w:rFonts w:ascii="Consolas" w:hAnsi="Consolas" w:eastAsia="Consolas"/>
+          <w:sz w:val="16"/>
+        </w:rPr>
+        <w:t xml:space="preserve">  padj 为 NA        : 832</w:t>
+      </w:r>
+    </w:p>
+    <w:p>
+      <w:pPr>
+        <w:spacing w:after="0" w:before="0" w:line="240" w:lineRule="auto"/>
+      </w:pPr>
+      <w:r>
+        <w:rPr>
+          <w:rFonts w:ascii="Consolas" w:hAnsi="Consolas" w:eastAsia="Consolas"/>
+          <w:sz w:val="16"/>
+        </w:rPr>
+        <w:t xml:space="preserve">  仅过 padj 未过效应量: 2068</w:t>
+      </w:r>
+    </w:p>
+    <w:p>
+      <w:pPr>
+        <w:spacing w:after="0" w:before="0" w:line="240" w:lineRule="auto"/>
+      </w:pPr>
+      <w:r>
+        <w:rPr>
+          <w:rFonts w:ascii="Consolas" w:hAnsi="Consolas" w:eastAsia="Consolas"/>
+          <w:sz w:val="16"/>
+        </w:rPr>
+        <w:t>方向核验: top20 中 20 个与原始组均值一致</w:t>
+      </w:r>
+    </w:p>
+    <w:p>
+      <w:pPr>
+        <w:spacing w:after="0" w:before="0" w:line="240" w:lineRule="auto"/>
+      </w:pPr>
+      <w:r>
+        <w:rPr>
+          <w:rFonts w:ascii="Consolas" w:hAnsi="Consolas" w:eastAsia="Consolas"/>
+          <w:sz w:val="16"/>
+        </w:rPr>
+      </w:r>
+    </w:p>
+    <w:p>
+      <w:pPr>
+        <w:spacing w:after="0" w:before="0" w:line="240" w:lineRule="auto"/>
+      </w:pPr>
+      <w:r>
+        <w:rPr>
+          <w:rFonts w:ascii="Consolas" w:hAnsi="Consolas" w:eastAsia="Consolas"/>
+          <w:sz w:val="16"/>
+        </w:rPr>
+        <w:t>完成。产物写入 D:/BioLession in total/Bioinformatics/week5/hw2_rebuild</w:t>
+      </w:r>
+    </w:p>
+    <w:p>
+      <w:pPr>
+        <w:spacing w:after="0" w:before="0" w:line="240" w:lineRule="auto"/>
+      </w:pPr>
+      <w:r>
+        <w:rPr>
+          <w:rFonts w:ascii="Consolas" w:hAnsi="Consolas" w:eastAsia="Consolas"/>
+          <w:sz w:val="16"/>
+        </w:rPr>
+      </w:r>
+    </w:p>
+    <w:p>
+      <w:pPr>
+        <w:spacing w:after="0" w:before="0" w:line="240" w:lineRule="auto"/>
+      </w:pPr>
+      <w:r>
+        <w:rPr>
+          <w:rFonts w:ascii="Consolas" w:hAnsi="Consolas" w:eastAsia="Consolas"/>
+          <w:sz w:val="16"/>
+        </w:rPr>
+        <w:t>---------- 运行结束，退出码 0 ----------</w:t>
+      </w:r>
+    </w:p>
+    <w:p>
+      <w:r>
+        <w:br w:type="page"/>
+      </w:r>
+    </w:p>
+    <w:p>
+      <w:pPr>
+        <w:spacing w:before="320" w:after="120"/>
+      </w:pPr>
+      <w:r>
+        <w:rPr>
+          <w:b/>
+          <w:color w:val="2F2F6F"/>
+          <w:sz w:val="30"/>
+          <w:rFonts w:eastAsia="Microsoft YaHei"/>
+        </w:rPr>
+        <w:t>附录 C — AI 使用审计表</w:t>
+      </w:r>
+    </w:p>
+    <w:p>
+      <w:pPr>
+        <w:spacing w:after="120"/>
+      </w:pPr>
+      <w:r>
+        <w:rPr>
+          <w:i w:val="0"/>
+          <w:color w:val="1A1A1A"/>
+          <w:sz w:val="21"/>
+          <w:rFonts w:eastAsia="Microsoft YaHei"/>
+        </w:rPr>
+        <w:t>记录 AI 提出的每一项建议、我如何核验、以及最终决定。被否决的条目同样列出。</w:t>
+      </w:r>
+    </w:p>
+    <w:tbl>
+      <w:tblPr>
+        <w:tblW w:type="auto" w:w="0"/>
+        <w:tblLook w:firstColumn="1" w:firstRow="1" w:lastColumn="0" w:lastRow="0" w:noHBand="0" w:noVBand="1" w:val="04A0"/>
+        <w:tblBorders>
+          <w:top w:val="single" w:sz="4" w:color="9A9AA6"/>
+          <w:left w:val="single" w:sz="4" w:color="9A9AA6"/>
+          <w:bottom w:val="single" w:sz="4" w:color="9A9AA6"/>
+          <w:right w:val="single" w:sz="4" w:color="9A9AA6"/>
+          <w:insideH w:val="single" w:sz="4" w:color="9A9AA6"/>
+          <w:insideV w:val="single" w:sz="4" w:color="9A9AA6"/>
+        </w:tblBorders>
+      </w:tblPr>
+      <w:tblGrid>
+        <w:gridCol w:w="2584"/>
+        <w:gridCol w:w="2584"/>
+        <w:gridCol w:w="2584"/>
+      </w:tblGrid>
+      <w:tr>
+        <w:tc>
+          <w:tcPr>
+            <w:tcW w:type="dxa" w:w="2584"/>
+            <w:shd w:val="clear" w:fill="E8E8F2"/>
+          </w:tcPr>
+          <w:p>
+            <w:pPr>
+              <w:spacing w:after="40"/>
+            </w:pPr>
+            <w:r/>
+            <w:r>
+              <w:rPr>
+                <w:b/>
+                <w:sz w:val="17"/>
+                <w:rFonts w:eastAsia="Microsoft YaHei"/>
+              </w:rPr>
+              <w:t>AI 建议</w:t>
+            </w:r>
+          </w:p>
+        </w:tc>
+        <w:tc>
+          <w:tcPr>
+            <w:tcW w:type="dxa" w:w="2584"/>
+            <w:shd w:val="clear" w:fill="E8E8F2"/>
+          </w:tcPr>
+          <w:p>
+            <w:pPr>
+              <w:spacing w:after="40"/>
+            </w:pPr>
+            <w:r/>
+            <w:r>
+              <w:rPr>
+                <w:b/>
+                <w:sz w:val="17"/>
+                <w:rFonts w:eastAsia="Microsoft YaHei"/>
+              </w:rPr>
+              <w:t>我的核验</w:t>
+            </w:r>
+          </w:p>
+        </w:tc>
+        <w:tc>
+          <w:tcPr>
+            <w:tcW w:type="dxa" w:w="2584"/>
+            <w:shd w:val="clear" w:fill="E8E8F2"/>
+          </w:tcPr>
+          <w:p>
+            <w:pPr>
+              <w:spacing w:after="40"/>
+            </w:pPr>
+            <w:r/>
+            <w:r>
+              <w:rPr>
+                <w:b/>
+                <w:sz w:val="17"/>
+                <w:rFonts w:eastAsia="Microsoft YaHei"/>
+              </w:rPr>
+              <w:t>最终决定</w:t>
+            </w:r>
+          </w:p>
+        </w:tc>
+      </w:tr>
+      <w:tr>
+        <w:tc>
+          <w:tcPr>
+            <w:tcW w:type="dxa" w:w="2584"/>
+          </w:tcPr>
+          <w:p>
+            <w:pPr>
+              <w:spacing w:after="40"/>
+            </w:pPr>
+            <w:r/>
+            <w:r>
+              <w:rPr>
+                <w:b w:val="0"/>
+                <w:sz w:val="17"/>
+                <w:rFonts w:eastAsia="Microsoft YaHei"/>
+              </w:rPr>
+              <w:t>用 log 转换后的 assay 矩阵作为 DESeq2 输入</w:t>
+            </w:r>
+          </w:p>
+        </w:tc>
+        <w:tc>
+          <w:tcPr>
+            <w:tcW w:type="dxa" w:w="2584"/>
+          </w:tcPr>
+          <w:p>
+            <w:pPr>
+              <w:spacing w:after="40"/>
+            </w:pPr>
+            <w:r/>
+            <w:r>
+              <w:rPr>
+                <w:b w:val="0"/>
+                <w:sz w:val="17"/>
+                <w:rFonts w:eastAsia="Microsoft YaHei"/>
+              </w:rPr>
+              <w:t>DESeq2 要求原始整数计数；log 矩阵会触发 not integers 报错，且违反模型假设</w:t>
+            </w:r>
+          </w:p>
+        </w:tc>
+        <w:tc>
+          <w:tcPr>
+            <w:tcW w:type="dxa" w:w="2584"/>
+          </w:tcPr>
+          <w:p>
+            <w:pPr>
+              <w:spacing w:after="40"/>
+            </w:pPr>
+            <w:r/>
+            <w:r>
+              <w:rPr>
+                <w:b w:val="0"/>
+                <w:sz w:val="17"/>
+                <w:rFonts w:eastAsia="Microsoft YaHei"/>
+              </w:rPr>
+              <w:t>否决。改用 tests/RNAseq_output.csv 的原始整数计数</w:t>
+            </w:r>
+          </w:p>
+        </w:tc>
+      </w:tr>
+      <w:tr>
+        <w:tc>
+          <w:tcPr>
+            <w:tcW w:type="dxa" w:w="2584"/>
+          </w:tcPr>
+          <w:p>
+            <w:pPr>
+              <w:spacing w:after="40"/>
+            </w:pPr>
+            <w:r/>
+            <w:r>
+              <w:rPr>
+                <w:b w:val="0"/>
+                <w:sz w:val="17"/>
+                <w:rFonts w:eastAsia="Microsoft YaHei"/>
+              </w:rPr>
+              <w:t>推测平台的过滤规则并在 R 中复现</w:t>
+            </w:r>
+          </w:p>
+        </w:tc>
+        <w:tc>
+          <w:tcPr>
+            <w:tcW w:type="dxa" w:w="2584"/>
+          </w:tcPr>
+          <w:p>
+            <w:pPr>
+              <w:spacing w:after="40"/>
+            </w:pPr>
+            <w:r/>
+            <w:r>
+              <w:rPr>
+                <w:b w:val="0"/>
+                <w:sz w:val="17"/>
+                <w:rFonts w:eastAsia="Microsoft YaHei"/>
+              </w:rPr>
+              <w:t>试了 11 种常见规则，无一得到 14245；被丢弃基因中存在 rowSum=143 且 24 样本全非零者，说明不是简单计数阈值</w:t>
+            </w:r>
+          </w:p>
+        </w:tc>
+        <w:tc>
+          <w:tcPr>
+            <w:tcW w:type="dxa" w:w="2584"/>
+          </w:tcPr>
+          <w:p>
+            <w:pPr>
+              <w:spacing w:after="40"/>
+            </w:pPr>
+            <w:r/>
+            <w:r>
+              <w:rPr>
+                <w:b w:val="0"/>
+                <w:sz w:val="17"/>
+                <w:rFonts w:eastAsia="Microsoft YaHei"/>
+              </w:rPr>
+              <w:t>否决。改为直接读取平台导出 assay 的基因名作为特征集</w:t>
+            </w:r>
+          </w:p>
+        </w:tc>
+      </w:tr>
+      <w:tr>
+        <w:tc>
+          <w:tcPr>
+            <w:tcW w:type="dxa" w:w="2584"/>
+          </w:tcPr>
+          <w:p>
+            <w:pPr>
+              <w:spacing w:after="40"/>
+            </w:pPr>
+            <w:r/>
+            <w:r>
+              <w:rPr>
+                <w:b w:val="0"/>
+                <w:sz w:val="17"/>
+                <w:rFonts w:eastAsia="Microsoft YaHei"/>
+              </w:rPr>
+              <w:t>把 R 重建结果当作平台输出提交</w:t>
+            </w:r>
+          </w:p>
+        </w:tc>
+        <w:tc>
+          <w:tcPr>
+            <w:tcW w:type="dxa" w:w="2584"/>
+          </w:tcPr>
+          <w:p>
+            <w:pPr>
+              <w:spacing w:after="40"/>
+            </w:pPr>
+            <w:r/>
+            <w:r>
+              <w:rPr>
+                <w:b w:val="0"/>
+                <w:sz w:val="17"/>
+                <w:rFonts w:eastAsia="Microsoft YaHei"/>
+              </w:rPr>
+              <w:t>两者统计实现、默认参数与版本均不同，数值不保证一致</w:t>
+            </w:r>
+          </w:p>
+        </w:tc>
+        <w:tc>
+          <w:tcPr>
+            <w:tcW w:type="dxa" w:w="2584"/>
+          </w:tcPr>
+          <w:p>
+            <w:pPr>
+              <w:spacing w:after="40"/>
+            </w:pPr>
+            <w:r/>
+            <w:r>
+              <w:rPr>
+                <w:b w:val="0"/>
+                <w:sz w:val="17"/>
+                <w:rFonts w:eastAsia="Microsoft YaHei"/>
+              </w:rPr>
+              <w:t>否决。分目录存放，README 与本附录均标明来源为 R 独立重跑</w:t>
+            </w:r>
+          </w:p>
+        </w:tc>
+      </w:tr>
+      <w:tr>
+        <w:tc>
+          <w:tcPr>
+            <w:tcW w:type="dxa" w:w="2584"/>
+          </w:tcPr>
+          <w:p>
+            <w:pPr>
+              <w:spacing w:after="40"/>
+            </w:pPr>
+            <w:r/>
+            <w:r>
+              <w:rPr>
+                <w:b w:val="0"/>
+                <w:sz w:val="17"/>
+                <w:rFonts w:eastAsia="Microsoft YaHei"/>
+              </w:rPr>
+              <w:t>由 AI 撰写第 4.3 节的生物学解释</w:t>
+            </w:r>
+          </w:p>
+        </w:tc>
+        <w:tc>
+          <w:tcPr>
+            <w:tcW w:type="dxa" w:w="2584"/>
+          </w:tcPr>
+          <w:p>
+            <w:pPr>
+              <w:spacing w:after="40"/>
+            </w:pPr>
+            <w:r/>
+            <w:r>
+              <w:rPr>
+                <w:b w:val="0"/>
+                <w:sz w:val="17"/>
+                <w:rFonts w:eastAsia="Microsoft YaHei"/>
+              </w:rPr>
+              <w:t>该节为本人对表达谱的推断与对实验设计的判断，属独立推理部分</w:t>
+            </w:r>
+          </w:p>
+        </w:tc>
+        <w:tc>
+          <w:tcPr>
+            <w:tcW w:type="dxa" w:w="2584"/>
+          </w:tcPr>
+          <w:p>
+            <w:pPr>
+              <w:spacing w:after="40"/>
+            </w:pPr>
+            <w:r/>
+            <w:r>
+              <w:rPr>
+                <w:b w:val="0"/>
+                <w:sz w:val="17"/>
+                <w:rFonts w:eastAsia="Microsoft YaHei"/>
+              </w:rPr>
+              <w:t>否决。4.3 节由本人撰写，AI 未参与</w:t>
+            </w:r>
+          </w:p>
+        </w:tc>
+      </w:tr>
+      <w:tr>
+        <w:tc>
+          <w:tcPr>
+            <w:tcW w:type="dxa" w:w="2584"/>
+          </w:tcPr>
+          <w:p>
+            <w:pPr>
+              <w:spacing w:after="40"/>
+            </w:pPr>
+            <w:r/>
+            <w:r>
+              <w:rPr>
+                <w:b w:val="0"/>
+                <w:sz w:val="17"/>
+                <w:rFonts w:eastAsia="Microsoft YaHei"/>
+              </w:rPr>
+              <w:t>假定差异分析的对比方向为 DMSO→T4400</w:t>
+            </w:r>
+          </w:p>
+        </w:tc>
+        <w:tc>
+          <w:tcPr>
+            <w:tcW w:type="dxa" w:w="2584"/>
+          </w:tcPr>
+          <w:p>
+            <w:pPr>
+              <w:spacing w:after="40"/>
+            </w:pPr>
+            <w:r/>
+            <w:r>
+              <w:rPr>
+                <w:b w:val="0"/>
+                <w:sz w:val="17"/>
+                <w:rFonts w:eastAsia="Microsoft YaHei"/>
+              </w:rPr>
+              <w:t>导出 CSV 不含方向元数据；我在平台界面核对，初次设置为 REFERENCE=T4400 方向相反</w:t>
+            </w:r>
+          </w:p>
+        </w:tc>
+        <w:tc>
+          <w:tcPr>
+            <w:tcW w:type="dxa" w:w="2584"/>
+          </w:tcPr>
+          <w:p>
+            <w:pPr>
+              <w:spacing w:after="40"/>
+            </w:pPr>
+            <w:r/>
+            <w:r>
+              <w:rPr>
+                <w:b w:val="0"/>
+                <w:sz w:val="17"/>
+                <w:rFonts w:eastAsia="Microsoft YaHei"/>
+              </w:rPr>
+              <w:t>已更正为 REFERENCE=DMSO / TEST=T4400，并在 R 重建中用 relevel 显式固定</w:t>
+            </w:r>
+          </w:p>
+        </w:tc>
+      </w:tr>
+      <w:tr>
+        <w:tc>
+          <w:tcPr>
+            <w:tcW w:type="dxa" w:w="2584"/>
+          </w:tcPr>
+          <w:p>
+            <w:pPr>
+              <w:spacing w:after="40"/>
+            </w:pPr>
+            <w:r/>
+            <w:r>
+              <w:rPr>
+                <w:b w:val="0"/>
+                <w:sz w:val="17"/>
+                <w:rFonts w:eastAsia="Microsoft YaHei"/>
+              </w:rPr>
+              <w:t>直接采用 resultsNames 的第二个系数</w:t>
+            </w:r>
+          </w:p>
+        </w:tc>
+        <w:tc>
+          <w:tcPr>
+            <w:tcW w:type="dxa" w:w="2584"/>
+          </w:tcPr>
+          <w:p>
+            <w:pPr>
+              <w:spacing w:after="40"/>
+            </w:pPr>
+            <w:r/>
+            <w:r>
+              <w:rPr>
+                <w:b w:val="0"/>
+                <w:sz w:val="17"/>
+                <w:rFonts w:eastAsia="Microsoft YaHei"/>
+              </w:rPr>
+              <w:t>系数名不应假设；脚本中加入 stopifnot 显式核对</w:t>
+            </w:r>
+          </w:p>
+        </w:tc>
+        <w:tc>
+          <w:tcPr>
+            <w:tcW w:type="dxa" w:w="2584"/>
+          </w:tcPr>
+          <w:p>
+            <w:pPr>
+              <w:spacing w:after="40"/>
+            </w:pPr>
+            <w:r/>
+            <w:r>
+              <w:rPr>
+                <w:b w:val="0"/>
+                <w:sz w:val="17"/>
+                <w:rFonts w:eastAsia="Microsoft YaHei"/>
+              </w:rPr>
+              <w:t>采纳但加固。核对结果为 Group_T4400_vs_DMSO</w:t>
+            </w:r>
+          </w:p>
+        </w:tc>
+      </w:tr>
+      <w:tr>
+        <w:tc>
+          <w:tcPr>
+            <w:tcW w:type="dxa" w:w="2584"/>
+          </w:tcPr>
+          <w:p>
+            <w:pPr>
+              <w:spacing w:after="40"/>
+            </w:pPr>
+            <w:r/>
+            <w:r>
+              <w:rPr>
+                <w:b w:val="0"/>
+                <w:sz w:val="17"/>
+                <w:rFonts w:eastAsia="Microsoft YaHei"/>
+              </w:rPr>
+              <w:t>以 padj 单一阈值判定显著</w:t>
+            </w:r>
+          </w:p>
+        </w:tc>
+        <w:tc>
+          <w:tcPr>
+            <w:tcW w:type="dxa" w:w="2584"/>
+          </w:tcPr>
+          <w:p>
+            <w:pPr>
+              <w:spacing w:after="40"/>
+            </w:pPr>
+            <w:r/>
+            <w:r>
+              <w:rPr>
+                <w:b w:val="0"/>
+                <w:sz w:val="17"/>
+                <w:rFonts w:eastAsia="Microsoft YaHei"/>
+              </w:rPr>
+              <w:t>小 padj 不等于生物学重要；课程要求同时报告统计与效应量阈值</w:t>
+            </w:r>
+          </w:p>
+        </w:tc>
+        <w:tc>
+          <w:tcPr>
+            <w:tcW w:type="dxa" w:w="2584"/>
+          </w:tcPr>
+          <w:p>
+            <w:pPr>
+              <w:spacing w:after="40"/>
+            </w:pPr>
+            <w:r/>
+            <w:r>
+              <w:rPr>
+                <w:b w:val="0"/>
+                <w:sz w:val="17"/>
+                <w:rFonts w:eastAsia="Microsoft YaHei"/>
+              </w:rPr>
+              <w:t>采纳并补充。同时使用 padj&lt;0.05 与 |log2FC|&gt;=1，并单独报告仅过 padj 的 2068 个基因</w:t>
+            </w:r>
+          </w:p>
+        </w:tc>
+      </w:tr>
+    </w:tbl>
+    <w:p/>
+    <w:p>
+      <w:pPr>
+        <w:spacing w:after="120"/>
+      </w:pPr>
+      <w:r>
+        <w:rPr>
+          <w:i w:val="0"/>
+          <w:color w:val="1A1A1A"/>
+          <w:sz w:val="21"/>
+          <w:rFonts w:eastAsia="Microsoft YaHei"/>
+        </w:rPr>
+        <w:t>另有一处由本人在平台操作中发现并更正、AI 未涉及的问题：GSEA 与富集面板的 ORGANISM 下拉在安装 org.Mm.eg.db 后会复位回 Human，导致报 'hsa' is missing；每次运行前均需重新确认为 Mouse。</w:t>
+      </w:r>
+    </w:p>
+    <w:p>
+      <w:r>
+        <w:br w:type="page"/>
+      </w:r>
+    </w:p>
+    <w:p>
+      <w:pPr>
+        <w:spacing w:before="320" w:after="120"/>
+      </w:pPr>
+      <w:r>
+        <w:rPr>
+          <w:b/>
+          <w:color w:val="2F2F6F"/>
+          <w:sz w:val="30"/>
+          <w:rFonts w:eastAsia="Microsoft YaHei"/>
+        </w:rPr>
+        <w:t>附录 D — 运行环境 sessionInfo()</w:t>
+      </w:r>
+    </w:p>
+    <w:p>
+      <w:pPr>
+        <w:spacing w:after="0" w:before="0" w:line="240" w:lineRule="auto"/>
+      </w:pPr>
+      <w:r>
+        <w:rPr>
+          <w:rFonts w:ascii="Consolas" w:hAnsi="Consolas" w:eastAsia="Consolas"/>
+          <w:sz w:val="15"/>
+        </w:rPr>
+        <w:t>R version 4.6.1 (2026-06-24 ucrt)</w:t>
+      </w:r>
+    </w:p>
+    <w:p>
+      <w:pPr>
+        <w:spacing w:after="0" w:before="0" w:line="240" w:lineRule="auto"/>
+      </w:pPr>
+      <w:r>
+        <w:rPr>
+          <w:rFonts w:ascii="Consolas" w:hAnsi="Consolas" w:eastAsia="Consolas"/>
+          <w:sz w:val="15"/>
+        </w:rPr>
+        <w:t>Platform: x86_64-w64-mingw32/x64</w:t>
+      </w:r>
+    </w:p>
+    <w:p>
+      <w:pPr>
+        <w:spacing w:after="0" w:before="0" w:line="240" w:lineRule="auto"/>
+      </w:pPr>
+      <w:r>
+        <w:rPr>
+          <w:rFonts w:ascii="Consolas" w:hAnsi="Consolas" w:eastAsia="Consolas"/>
+          <w:sz w:val="15"/>
+        </w:rPr>
+        <w:t>Running under: Windows 11 x64 (build 26200)</w:t>
+      </w:r>
+    </w:p>
+    <w:p>
+      <w:pPr>
+        <w:spacing w:after="0" w:before="0" w:line="240" w:lineRule="auto"/>
+      </w:pPr>
+      <w:r>
+        <w:rPr>
+          <w:rFonts w:ascii="Consolas" w:hAnsi="Consolas" w:eastAsia="Consolas"/>
+          <w:sz w:val="15"/>
+        </w:rPr>
+      </w:r>
+    </w:p>
+    <w:p>
+      <w:pPr>
+        <w:spacing w:after="0" w:before="0" w:line="240" w:lineRule="auto"/>
+      </w:pPr>
+      <w:r>
+        <w:rPr>
+          <w:rFonts w:ascii="Consolas" w:hAnsi="Consolas" w:eastAsia="Consolas"/>
+          <w:sz w:val="15"/>
+        </w:rPr>
+        <w:t>Matrix products: default</w:t>
+      </w:r>
+    </w:p>
+    <w:p>
+      <w:pPr>
+        <w:spacing w:after="0" w:before="0" w:line="240" w:lineRule="auto"/>
+      </w:pPr>
+      <w:r>
+        <w:rPr>
+          <w:rFonts w:ascii="Consolas" w:hAnsi="Consolas" w:eastAsia="Consolas"/>
+          <w:sz w:val="15"/>
+        </w:rPr>
+        <w:t xml:space="preserve">  LAPACK version 3.12.1</w:t>
+      </w:r>
+    </w:p>
+    <w:p>
+      <w:pPr>
+        <w:spacing w:after="0" w:before="0" w:line="240" w:lineRule="auto"/>
+      </w:pPr>
+      <w:r>
+        <w:rPr>
+          <w:rFonts w:ascii="Consolas" w:hAnsi="Consolas" w:eastAsia="Consolas"/>
+          <w:sz w:val="15"/>
+        </w:rPr>
+      </w:r>
+    </w:p>
+    <w:p>
+      <w:pPr>
+        <w:spacing w:after="0" w:before="0" w:line="240" w:lineRule="auto"/>
+      </w:pPr>
+      <w:r>
+        <w:rPr>
+          <w:rFonts w:ascii="Consolas" w:hAnsi="Consolas" w:eastAsia="Consolas"/>
+          <w:sz w:val="15"/>
+        </w:rPr>
+        <w:t>locale:</w:t>
+      </w:r>
+    </w:p>
+    <w:p>
+      <w:pPr>
+        <w:spacing w:after="0" w:before="0" w:line="240" w:lineRule="auto"/>
+      </w:pPr>
+      <w:r>
+        <w:rPr>
+          <w:rFonts w:ascii="Consolas" w:hAnsi="Consolas" w:eastAsia="Consolas"/>
+          <w:sz w:val="15"/>
+        </w:rPr>
+        <w:t xml:space="preserve">[1] LC_COLLATE=Chinese (Simplified)_China.utf8 </w:t>
+      </w:r>
+    </w:p>
+    <w:p>
+      <w:pPr>
+        <w:spacing w:after="0" w:before="0" w:line="240" w:lineRule="auto"/>
+      </w:pPr>
+      <w:r>
+        <w:rPr>
+          <w:rFonts w:ascii="Consolas" w:hAnsi="Consolas" w:eastAsia="Consolas"/>
+          <w:sz w:val="15"/>
+        </w:rPr>
+        <w:t xml:space="preserve">[2] LC_CTYPE=Chinese (Simplified)_China.utf8   </w:t>
+      </w:r>
+    </w:p>
+    <w:p>
+      <w:pPr>
+        <w:spacing w:after="0" w:before="0" w:line="240" w:lineRule="auto"/>
+      </w:pPr>
+      <w:r>
+        <w:rPr>
+          <w:rFonts w:ascii="Consolas" w:hAnsi="Consolas" w:eastAsia="Consolas"/>
+          <w:sz w:val="15"/>
+        </w:rPr>
+        <w:t>[3] LC_MONETARY=Chinese (Simplified)_China.utf8</w:t>
+      </w:r>
+    </w:p>
+    <w:p>
+      <w:pPr>
+        <w:spacing w:after="0" w:before="0" w:line="240" w:lineRule="auto"/>
+      </w:pPr>
+      <w:r>
+        <w:rPr>
+          <w:rFonts w:ascii="Consolas" w:hAnsi="Consolas" w:eastAsia="Consolas"/>
+          <w:sz w:val="15"/>
+        </w:rPr>
+        <w:t xml:space="preserve">[4] LC_NUMERIC=C                               </w:t>
+      </w:r>
+    </w:p>
+    <w:p>
+      <w:pPr>
+        <w:spacing w:after="0" w:before="0" w:line="240" w:lineRule="auto"/>
+      </w:pPr>
+      <w:r>
+        <w:rPr>
+          <w:rFonts w:ascii="Consolas" w:hAnsi="Consolas" w:eastAsia="Consolas"/>
+          <w:sz w:val="15"/>
+        </w:rPr>
+        <w:t xml:space="preserve">[5] LC_TIME=Chinese (Simplified)_China.utf8    </w:t>
+      </w:r>
+    </w:p>
+    <w:p>
+      <w:pPr>
+        <w:spacing w:after="0" w:before="0" w:line="240" w:lineRule="auto"/>
+      </w:pPr>
+      <w:r>
+        <w:rPr>
+          <w:rFonts w:ascii="Consolas" w:hAnsi="Consolas" w:eastAsia="Consolas"/>
+          <w:sz w:val="15"/>
+        </w:rPr>
+      </w:r>
+    </w:p>
+    <w:p>
+      <w:pPr>
+        <w:spacing w:after="0" w:before="0" w:line="240" w:lineRule="auto"/>
+      </w:pPr>
+      <w:r>
+        <w:rPr>
+          <w:rFonts w:ascii="Consolas" w:hAnsi="Consolas" w:eastAsia="Consolas"/>
+          <w:sz w:val="15"/>
+        </w:rPr>
+        <w:t>time zone: Asia/Shanghai</w:t>
+      </w:r>
+    </w:p>
+    <w:p>
+      <w:pPr>
+        <w:spacing w:after="0" w:before="0" w:line="240" w:lineRule="auto"/>
+      </w:pPr>
+      <w:r>
+        <w:rPr>
+          <w:rFonts w:ascii="Consolas" w:hAnsi="Consolas" w:eastAsia="Consolas"/>
+          <w:sz w:val="15"/>
+        </w:rPr>
+        <w:t>tzcode source: internal</w:t>
+      </w:r>
+    </w:p>
+    <w:p>
+      <w:pPr>
+        <w:spacing w:after="0" w:before="0" w:line="240" w:lineRule="auto"/>
+      </w:pPr>
+      <w:r>
+        <w:rPr>
+          <w:rFonts w:ascii="Consolas" w:hAnsi="Consolas" w:eastAsia="Consolas"/>
+          <w:sz w:val="15"/>
+        </w:rPr>
+      </w:r>
+    </w:p>
+    <w:p>
+      <w:pPr>
+        <w:spacing w:after="0" w:before="0" w:line="240" w:lineRule="auto"/>
+      </w:pPr>
+      <w:r>
+        <w:rPr>
+          <w:rFonts w:ascii="Consolas" w:hAnsi="Consolas" w:eastAsia="Consolas"/>
+          <w:sz w:val="15"/>
+        </w:rPr>
+        <w:t>attached base packages:</w:t>
+      </w:r>
+    </w:p>
+    <w:p>
+      <w:pPr>
+        <w:spacing w:after="0" w:before="0" w:line="240" w:lineRule="auto"/>
+      </w:pPr>
+      <w:r>
+        <w:rPr>
+          <w:rFonts w:ascii="Consolas" w:hAnsi="Consolas" w:eastAsia="Consolas"/>
+          <w:sz w:val="15"/>
+        </w:rPr>
+        <w:t xml:space="preserve">[1] stats4    stats     graphics  grDevices utils     datasets  methods  </w:t>
+      </w:r>
+    </w:p>
+    <w:p>
+      <w:pPr>
+        <w:spacing w:after="0" w:before="0" w:line="240" w:lineRule="auto"/>
+      </w:pPr>
+      <w:r>
+        <w:rPr>
+          <w:rFonts w:ascii="Consolas" w:hAnsi="Consolas" w:eastAsia="Consolas"/>
+          <w:sz w:val="15"/>
+        </w:rPr>
+        <w:t xml:space="preserve">[8] base     </w:t>
+      </w:r>
+    </w:p>
+    <w:p>
+      <w:pPr>
+        <w:spacing w:after="0" w:before="0" w:line="240" w:lineRule="auto"/>
+      </w:pPr>
+      <w:r>
+        <w:rPr>
+          <w:rFonts w:ascii="Consolas" w:hAnsi="Consolas" w:eastAsia="Consolas"/>
+          <w:sz w:val="15"/>
+        </w:rPr>
+      </w:r>
+    </w:p>
+    <w:p>
+      <w:pPr>
+        <w:spacing w:after="0" w:before="0" w:line="240" w:lineRule="auto"/>
+      </w:pPr>
+      <w:r>
+        <w:rPr>
+          <w:rFonts w:ascii="Consolas" w:hAnsi="Consolas" w:eastAsia="Consolas"/>
+          <w:sz w:val="15"/>
+        </w:rPr>
+        <w:t>other attached packages:</w:t>
+      </w:r>
+    </w:p>
+    <w:p>
+      <w:pPr>
+        <w:spacing w:after="0" w:before="0" w:line="240" w:lineRule="auto"/>
+      </w:pPr>
+      <w:r>
+        <w:rPr>
+          <w:rFonts w:ascii="Consolas" w:hAnsi="Consolas" w:eastAsia="Consolas"/>
+          <w:sz w:val="15"/>
+        </w:rPr>
+        <w:t xml:space="preserve"> [1] ggrepel_0.9.8               ggplot2_4.0.3              </w:t>
+      </w:r>
+    </w:p>
+    <w:p>
+      <w:pPr>
+        <w:spacing w:after="0" w:before="0" w:line="240" w:lineRule="auto"/>
+      </w:pPr>
+      <w:r>
+        <w:rPr>
+          <w:rFonts w:ascii="Consolas" w:hAnsi="Consolas" w:eastAsia="Consolas"/>
+          <w:sz w:val="15"/>
+        </w:rPr>
+        <w:t xml:space="preserve"> [3] DESeq2_1.52.0               SummarizedExperiment_1.42.0</w:t>
+      </w:r>
+    </w:p>
+    <w:p>
+      <w:pPr>
+        <w:spacing w:after="0" w:before="0" w:line="240" w:lineRule="auto"/>
+      </w:pPr>
+      <w:r>
+        <w:rPr>
+          <w:rFonts w:ascii="Consolas" w:hAnsi="Consolas" w:eastAsia="Consolas"/>
+          <w:sz w:val="15"/>
+        </w:rPr>
+        <w:t xml:space="preserve"> [5] Biobase_2.72.0              MatrixGenerics_1.24.0      </w:t>
+      </w:r>
+    </w:p>
+    <w:p>
+      <w:pPr>
+        <w:spacing w:after="0" w:before="0" w:line="240" w:lineRule="auto"/>
+      </w:pPr>
+      <w:r>
+        <w:rPr>
+          <w:rFonts w:ascii="Consolas" w:hAnsi="Consolas" w:eastAsia="Consolas"/>
+          <w:sz w:val="15"/>
+        </w:rPr>
+        <w:t xml:space="preserve"> [7] matrixStats_1.5.0           GenomicRanges_1.64.0       </w:t>
+      </w:r>
+    </w:p>
+    <w:p>
+      <w:pPr>
+        <w:spacing w:after="0" w:before="0" w:line="240" w:lineRule="auto"/>
+      </w:pPr>
+      <w:r>
+        <w:rPr>
+          <w:rFonts w:ascii="Consolas" w:hAnsi="Consolas" w:eastAsia="Consolas"/>
+          <w:sz w:val="15"/>
+        </w:rPr>
+        <w:t xml:space="preserve"> [9] Seqinfo_1.2.0               IRanges_2.46.0             </w:t>
+      </w:r>
+    </w:p>
+    <w:p>
+      <w:pPr>
+        <w:spacing w:after="0" w:before="0" w:line="240" w:lineRule="auto"/>
+      </w:pPr>
+      <w:r>
+        <w:rPr>
+          <w:rFonts w:ascii="Consolas" w:hAnsi="Consolas" w:eastAsia="Consolas"/>
+          <w:sz w:val="15"/>
+        </w:rPr>
+        <w:t xml:space="preserve">[11] S4Vectors_0.50.2            BiocGenerics_0.58.1        </w:t>
+      </w:r>
+    </w:p>
+    <w:p>
+      <w:pPr>
+        <w:spacing w:after="0" w:before="0" w:line="240" w:lineRule="auto"/>
+      </w:pPr>
+      <w:r>
+        <w:rPr>
+          <w:rFonts w:ascii="Consolas" w:hAnsi="Consolas" w:eastAsia="Consolas"/>
+          <w:sz w:val="15"/>
+        </w:rPr>
+        <w:t xml:space="preserve">[13] generics_0.1.4             </w:t>
+      </w:r>
+    </w:p>
+    <w:p>
+      <w:pPr>
+        <w:spacing w:after="0" w:before="0" w:line="240" w:lineRule="auto"/>
+      </w:pPr>
+      <w:r>
+        <w:rPr>
+          <w:rFonts w:ascii="Consolas" w:hAnsi="Consolas" w:eastAsia="Consolas"/>
+          <w:sz w:val="15"/>
+        </w:rPr>
+      </w:r>
+    </w:p>
+    <w:p>
+      <w:pPr>
+        <w:spacing w:after="0" w:before="0" w:line="240" w:lineRule="auto"/>
+      </w:pPr>
+      <w:r>
+        <w:rPr>
+          <w:rFonts w:ascii="Consolas" w:hAnsi="Consolas" w:eastAsia="Consolas"/>
+          <w:sz w:val="15"/>
+        </w:rPr>
+        <w:t>loaded via a namespace (and not attached):</w:t>
+      </w:r>
+    </w:p>
+    <w:p>
+      <w:pPr>
+        <w:spacing w:after="0" w:before="0" w:line="240" w:lineRule="auto"/>
+      </w:pPr>
+      <w:r>
+        <w:rPr>
+          <w:rFonts w:ascii="Consolas" w:hAnsi="Consolas" w:eastAsia="Consolas"/>
+          <w:sz w:val="15"/>
+        </w:rPr>
+        <w:t xml:space="preserve"> [1] SparseArray_1.12.2  lattice_0.22-9      magrittr_2.0.5     </w:t>
+      </w:r>
+    </w:p>
+    <w:p>
+      <w:pPr>
+        <w:spacing w:after="0" w:before="0" w:line="240" w:lineRule="auto"/>
+      </w:pPr>
+      <w:r>
+        <w:rPr>
+          <w:rFonts w:ascii="Consolas" w:hAnsi="Consolas" w:eastAsia="Consolas"/>
+          <w:sz w:val="15"/>
+        </w:rPr>
+        <w:t xml:space="preserve"> [4] grid_4.6.1          RColorBrewer_1.1-3  mvtnorm_1.4-2      </w:t>
+      </w:r>
+    </w:p>
+    <w:p>
+      <w:pPr>
+        <w:spacing w:after="0" w:before="0" w:line="240" w:lineRule="auto"/>
+      </w:pPr>
+      <w:r>
+        <w:rPr>
+          <w:rFonts w:ascii="Consolas" w:hAnsi="Consolas" w:eastAsia="Consolas"/>
+          <w:sz w:val="15"/>
+        </w:rPr>
+        <w:t xml:space="preserve"> [7] plyr_1.8.9          Matrix_1.7-5        scales_1.4.0       </w:t>
+      </w:r>
+    </w:p>
+    <w:p>
+      <w:pPr>
+        <w:spacing w:after="0" w:before="0" w:line="240" w:lineRule="auto"/>
+      </w:pPr>
+      <w:r>
+        <w:rPr>
+          <w:rFonts w:ascii="Consolas" w:hAnsi="Consolas" w:eastAsia="Consolas"/>
+          <w:sz w:val="15"/>
+        </w:rPr>
+        <w:t xml:space="preserve">[10] numDeriv_2016.8-1.1 codetools_0.2-20    textshaping_1.0.5  </w:t>
+      </w:r>
+    </w:p>
+    <w:p>
+      <w:pPr>
+        <w:spacing w:after="0" w:before="0" w:line="240" w:lineRule="auto"/>
+      </w:pPr>
+      <w:r>
+        <w:rPr>
+          <w:rFonts w:ascii="Consolas" w:hAnsi="Consolas" w:eastAsia="Consolas"/>
+          <w:sz w:val="15"/>
+        </w:rPr>
+        <w:t xml:space="preserve">[13] abind_1.4-8         emdbook_1.3.14      cli_3.6.6          </w:t>
+      </w:r>
+    </w:p>
+    <w:p>
+      <w:pPr>
+        <w:spacing w:after="0" w:before="0" w:line="240" w:lineRule="auto"/>
+      </w:pPr>
+      <w:r>
+        <w:rPr>
+          <w:rFonts w:ascii="Consolas" w:hAnsi="Consolas" w:eastAsia="Consolas"/>
+          <w:sz w:val="15"/>
+        </w:rPr>
+        <w:t xml:space="preserve">[16] rlang_1.3.0         bbmle_1.0.26        XVector_0.52.0     </w:t>
+      </w:r>
+    </w:p>
+    <w:p>
+      <w:pPr>
+        <w:spacing w:after="0" w:before="0" w:line="240" w:lineRule="auto"/>
+      </w:pPr>
+      <w:r>
+        <w:rPr>
+          <w:rFonts w:ascii="Consolas" w:hAnsi="Consolas" w:eastAsia="Consolas"/>
+          <w:sz w:val="15"/>
+        </w:rPr>
+        <w:t xml:space="preserve">[19] withr_3.0.3         DelayedArray_0.38.2 S4Arrays_1.12.0    </w:t>
+      </w:r>
+    </w:p>
+    <w:p>
+      <w:pPr>
+        <w:spacing w:after="0" w:before="0" w:line="240" w:lineRule="auto"/>
+      </w:pPr>
+      <w:r>
+        <w:rPr>
+          <w:rFonts w:ascii="Consolas" w:hAnsi="Consolas" w:eastAsia="Consolas"/>
+          <w:sz w:val="15"/>
+        </w:rPr>
+        <w:t>[22] tools_4.6.1         parallel_4.6.1      BiocParallel_1.46.0</w:t>
+      </w:r>
+    </w:p>
+    <w:p>
+      <w:pPr>
+        <w:spacing w:after="0" w:before="0" w:line="240" w:lineRule="auto"/>
+      </w:pPr>
+      <w:r>
+        <w:rPr>
+          <w:rFonts w:ascii="Consolas" w:hAnsi="Consolas" w:eastAsia="Consolas"/>
+          <w:sz w:val="15"/>
+        </w:rPr>
+        <w:t xml:space="preserve">[25] coda_0.19-4.1       bdsmatrix_1.3-7     dplyr_1.2.1        </w:t>
+      </w:r>
+    </w:p>
+    <w:p>
+      <w:pPr>
+        <w:spacing w:after="0" w:before="0" w:line="240" w:lineRule="auto"/>
+      </w:pPr>
+      <w:r>
+        <w:rPr>
+          <w:rFonts w:ascii="Consolas" w:hAnsi="Consolas" w:eastAsia="Consolas"/>
+          <w:sz w:val="15"/>
+        </w:rPr>
+        <w:t xml:space="preserve">[28] locfit_1.5-9.12     vctrs_0.7.3         R6_2.6.1           </w:t>
+      </w:r>
+    </w:p>
+    <w:p>
+      <w:pPr>
+        <w:spacing w:after="0" w:before="0" w:line="240" w:lineRule="auto"/>
+      </w:pPr>
+      <w:r>
+        <w:rPr>
+          <w:rFonts w:ascii="Consolas" w:hAnsi="Consolas" w:eastAsia="Consolas"/>
+          <w:sz w:val="15"/>
+        </w:rPr>
+        <w:t xml:space="preserve">[31] lifecycle_1.0.5     MASS_7.3-65         ragg_1.5.2         </w:t>
+      </w:r>
+    </w:p>
+    <w:p>
+      <w:pPr>
+        <w:spacing w:after="0" w:before="0" w:line="240" w:lineRule="auto"/>
+      </w:pPr>
+      <w:r>
+        <w:rPr>
+          <w:rFonts w:ascii="Consolas" w:hAnsi="Consolas" w:eastAsia="Consolas"/>
+          <w:sz w:val="15"/>
+        </w:rPr>
+        <w:t xml:space="preserve">[34] pkgconfig_2.0.3     pillar_1.11.1       gtable_0.3.6       </w:t>
+      </w:r>
+    </w:p>
+    <w:p>
+      <w:pPr>
+        <w:spacing w:after="0" w:before="0" w:line="240" w:lineRule="auto"/>
+      </w:pPr>
+      <w:r>
+        <w:rPr>
+          <w:rFonts w:ascii="Consolas" w:hAnsi="Consolas" w:eastAsia="Consolas"/>
+          <w:sz w:val="15"/>
+        </w:rPr>
+        <w:t xml:space="preserve">[37] glue_1.8.1          Rcpp_1.1.2          systemfonts_1.3.2  </w:t>
+      </w:r>
+    </w:p>
+    <w:p>
+      <w:pPr>
+        <w:spacing w:after="0" w:before="0" w:line="240" w:lineRule="auto"/>
+      </w:pPr>
+      <w:r>
+        <w:rPr>
+          <w:rFonts w:ascii="Consolas" w:hAnsi="Consolas" w:eastAsia="Consolas"/>
+          <w:sz w:val="15"/>
+        </w:rPr>
+        <w:t xml:space="preserve">[40] tibble_3.3.1        tidyselect_1.2.1    farver_2.1.2       </w:t>
+      </w:r>
+    </w:p>
+    <w:p>
+      <w:pPr>
+        <w:spacing w:after="0" w:before="0" w:line="240" w:lineRule="auto"/>
+      </w:pPr>
+      <w:r>
+        <w:rPr>
+          <w:rFonts w:ascii="Consolas" w:hAnsi="Consolas" w:eastAsia="Consolas"/>
+          <w:sz w:val="15"/>
+        </w:rPr>
+        <w:t xml:space="preserve">[43] labeling_0.4.3      apeglm_1.34.0       compiler_4.6.1     </w:t>
+      </w:r>
+    </w:p>
+    <w:p>
+      <w:pPr>
+        <w:spacing w:after="0" w:before="0" w:line="240" w:lineRule="auto"/>
+      </w:pPr>
+      <w:r>
+        <w:rPr>
+          <w:rFonts w:ascii="Consolas" w:hAnsi="Consolas" w:eastAsia="Consolas"/>
+          <w:sz w:val="15"/>
+        </w:rPr>
+        <w:t xml:space="preserve">[46] S7_0.2.2           </w:t>
+      </w:r>
     </w:p>
     <w:sectPr>
       <w:pgSz w:w="11906" w:h="16838"/>

</xml_diff>

<commit_message>
﻿Fill in the student's reading of the ultrasound null result
Appendix E.3 had been left as a placeholder for the one judgement that is the
student's to make. It is now written: the contrast was run, nothing was detected
at n=4 with padj < 0.05 and |log2FC| >= 1, but T4400 found 128 genes under the
same design and sample size, so the detection is working and the ultrasound
effect must sit below this design's detection floor. It also corrects the
earlier statement in section 4.3 that the question could not be answered.

Written by the student across four revisions; AI pointed out that the first
draft asserted the conclusion before the evidence, and that a later draft had
dropped the sample-size qualifier.

Co-Authored-By: Claude Opus 5 <noreply@anthropic.com>
</commit_message>
<xml_diff>
--- a/Week5/HW2/作业二_EMP-Web分析报告.docx
+++ b/Week5/HW2/作业二_EMP-Web分析报告.docx
@@ -7872,12 +7872,12 @@
       <w:r>
         <w:rPr>
           <w:b w:val="0"/>
-          <w:i/>
-          <w:color w:val="B4341F"/>
+          <w:i w:val="0"/>
+          <w:color w:val="1A1A1A"/>
           <w:sz w:val="21"/>
           <w:rFonts w:eastAsia="Microsoft YaHei"/>
         </w:rPr>
-        <w:t>【需要我补充 1–2 句自己的解读：对照第 4.3 节我原先写的「本次对比没有涉及超声」，现在这一问已经能回答了——请写出我如何看待这个零结果，以及它对原先那句判断的修正。】</w:t>
+        <w:t>本次通过超声对比，结果是在现在的样本量和阈值下没有检测出差异，但是 T4400 检出了 128 个说明检测方法没有问题，所以最后的结论是超声的效应明显小于药物的效应，小到落在这个设计的检出线以下。这一问我原先写的是本次对比无法回答，现在已经可以回答了。</w:t>
       </w:r>
     </w:p>
     <w:p>

</xml_diff>